<commit_message>
Rimosse le righe Documenti di riferimento e Procedure collegate dalle copertine
Co-Authored-By: Claude Opus 5.5 <noreply@anthropic.com>
Claude-Session: https://claude.ai/code/session_017FNXRGi3qa62SAS8zgzmg1
</commit_message>
<xml_diff>
--- a/Procedure/Procedura_SIMATIC_Logon.docx
+++ b/Procedure/Procedura_SIMATIC_Logon.docx
@@ -325,116 +325,6 @@
             </w:pPr>
             <w:r>
               <w:t>Macchine con gestione utenti conforme 21 CFR Part 11 tramite SIMATIC Logon</w:t>
-            </w:r>
-          </w:p>
-        </w:tc>
-      </w:tr>
-      <w:tr>
-        <w:tc>
-          <w:tcPr>
-            <w:tcW w:type="dxa" w:w="4819"/>
-            <w:tcW w:w="2600" w:type="dxa"/>
-            <w:tcBorders>
-              <w:top w:val="single" w:sz="4" w:space="0" w:color="A6A6A6"/>
-              <w:left w:val="single" w:sz="4" w:space="0" w:color="A6A6A6"/>
-              <w:bottom w:val="single" w:sz="4" w:space="0" w:color="A6A6A6"/>
-              <w:right w:val="single" w:sz="4" w:space="0" w:color="A6A6A6"/>
-            </w:tcBorders>
-            <w:tcMar>
-              <w:top w:w="60" w:type="dxa"/>
-              <w:left w:w="100" w:type="dxa"/>
-              <w:bottom w:w="60" w:type="dxa"/>
-              <w:right w:w="100" w:type="dxa"/>
-            </w:tcMar>
-          </w:tcPr>
-          <w:p>
-            <w:pPr>
-              <w:spacing w:after="0"/>
-            </w:pPr>
-            <w:r>
-              <w:t>Documenti di riferimento</w:t>
-            </w:r>
-          </w:p>
-        </w:tc>
-        <w:tc>
-          <w:tcPr>
-            <w:tcW w:type="dxa" w:w="4819"/>
-            <w:tcW w:w="7038" w:type="dxa"/>
-            <w:tcBorders>
-              <w:top w:val="single" w:sz="4" w:space="0" w:color="A6A6A6"/>
-              <w:left w:val="single" w:sz="4" w:space="0" w:color="A6A6A6"/>
-              <w:bottom w:val="single" w:sz="4" w:space="0" w:color="A6A6A6"/>
-              <w:right w:val="single" w:sz="4" w:space="0" w:color="A6A6A6"/>
-            </w:tcBorders>
-            <w:tcMar>
-              <w:top w:w="60" w:type="dxa"/>
-              <w:left w:w="100" w:type="dxa"/>
-              <w:bottom w:w="60" w:type="dxa"/>
-              <w:right w:w="100" w:type="dxa"/>
-            </w:tcMar>
-          </w:tcPr>
-          <w:p>
-            <w:pPr>
-              <w:spacing w:after="0"/>
-            </w:pPr>
-            <w:r>
-              <w:t>Guida_SIMATIC_Logon.docx; CFR21_20 Guida Utili.pdf; Siemens CFR21 Guida Funzioni 1.1_ITA.pdf</w:t>
-            </w:r>
-          </w:p>
-        </w:tc>
-      </w:tr>
-      <w:tr>
-        <w:tc>
-          <w:tcPr>
-            <w:tcW w:type="dxa" w:w="4819"/>
-            <w:tcW w:w="2600" w:type="dxa"/>
-            <w:tcBorders>
-              <w:top w:val="single" w:sz="4" w:space="0" w:color="A6A6A6"/>
-              <w:left w:val="single" w:sz="4" w:space="0" w:color="A6A6A6"/>
-              <w:bottom w:val="single" w:sz="4" w:space="0" w:color="A6A6A6"/>
-              <w:right w:val="single" w:sz="4" w:space="0" w:color="A6A6A6"/>
-            </w:tcBorders>
-            <w:shd w:val="clear" w:color="auto" w:fill="F2F6FA"/>
-            <w:tcMar>
-              <w:top w:w="60" w:type="dxa"/>
-              <w:left w:w="100" w:type="dxa"/>
-              <w:bottom w:w="60" w:type="dxa"/>
-              <w:right w:w="100" w:type="dxa"/>
-            </w:tcMar>
-          </w:tcPr>
-          <w:p>
-            <w:pPr>
-              <w:spacing w:after="0"/>
-            </w:pPr>
-            <w:r>
-              <w:t>Procedure collegate</w:t>
-            </w:r>
-          </w:p>
-        </w:tc>
-        <w:tc>
-          <w:tcPr>
-            <w:tcW w:type="dxa" w:w="4819"/>
-            <w:tcW w:w="7038" w:type="dxa"/>
-            <w:tcBorders>
-              <w:top w:val="single" w:sz="4" w:space="0" w:color="A6A6A6"/>
-              <w:left w:val="single" w:sz="4" w:space="0" w:color="A6A6A6"/>
-              <w:bottom w:val="single" w:sz="4" w:space="0" w:color="A6A6A6"/>
-              <w:right w:val="single" w:sz="4" w:space="0" w:color="A6A6A6"/>
-            </w:tcBorders>
-            <w:shd w:val="clear" w:color="auto" w:fill="F2F6FA"/>
-            <w:tcMar>
-              <w:top w:w="60" w:type="dxa"/>
-              <w:left w:w="100" w:type="dxa"/>
-              <w:bottom w:w="60" w:type="dxa"/>
-              <w:right w:w="100" w:type="dxa"/>
-            </w:tcMar>
-          </w:tcPr>
-          <w:p>
-            <w:pPr>
-              <w:spacing w:after="0"/>
-            </w:pPr>
-            <w:r>
-              <w:t>Procedura 21 CFR Part 11 – Audit Trail; Procedura sincronizzazione ora NTP</w:t>
             </w:r>
           </w:p>
         </w:tc>

</xml_diff>

<commit_message>
Aggiunta procedura aspirazione a vuoto Festo; corrette larghezze colonne delle tabelle
Co-Authored-By: Claude Opus 5.5 <noreply@anthropic.com>
Claude-Session: https://claude.ai/code/session_017FNXRGi3qa62SAS8zgzmg1
</commit_message>
<xml_diff>
--- a/Procedure/Procedura_SIMATIC_Logon.docx
+++ b/Procedure/Procedura_SIMATIC_Logon.docx
@@ -34,16 +34,18 @@
     <w:p/>
     <w:tbl>
       <w:tblPr>
-        <w:tblW w:type="auto" w:w="0"/>
         <w:jc w:val="center"/>
         <w:tblLook w:firstColumn="1" w:firstRow="1" w:lastColumn="0" w:lastRow="0" w:noHBand="0" w:noVBand="1" w:val="04A0"/>
+        <w:tblW w:w="9638" w:type="dxa"/>
+        <w:tblLayout w:type="fixed"/>
       </w:tblPr>
       <w:tblGrid>
-        <w:gridCol w:w="4819"/>
-        <w:gridCol w:w="4819"/>
+        <w:gridCol w:w="2600"/>
+        <w:gridCol w:w="7038"/>
       </w:tblGrid>
       <w:tr>
         <w:trPr>
+          <w:cantSplit/>
           <w:tblHeader/>
         </w:trPr>
         <w:tc>
@@ -110,6 +112,9 @@
         </w:tc>
       </w:tr>
       <w:tr>
+        <w:trPr>
+          <w:cantSplit/>
+        </w:trPr>
         <w:tc>
           <w:tcPr>
             <w:tcW w:type="dxa" w:w="4819"/>
@@ -164,6 +169,9 @@
         </w:tc>
       </w:tr>
       <w:tr>
+        <w:trPr>
+          <w:cantSplit/>
+        </w:trPr>
         <w:tc>
           <w:tcPr>
             <w:tcW w:type="dxa" w:w="4819"/>
@@ -220,6 +228,9 @@
         </w:tc>
       </w:tr>
       <w:tr>
+        <w:trPr>
+          <w:cantSplit/>
+        </w:trPr>
         <w:tc>
           <w:tcPr>
             <w:tcW w:type="dxa" w:w="4819"/>
@@ -274,6 +285,9 @@
         </w:tc>
       </w:tr>
       <w:tr>
+        <w:trPr>
+          <w:cantSplit/>
+        </w:trPr>
         <w:tc>
           <w:tcPr>
             <w:tcW w:type="dxa" w:w="4819"/>
@@ -459,16 +473,18 @@
     </w:p>
     <w:tbl>
       <w:tblPr>
-        <w:tblW w:type="auto" w:w="0"/>
         <w:jc w:val="center"/>
         <w:tblLook w:firstColumn="1" w:firstRow="1" w:lastColumn="0" w:lastRow="0" w:noHBand="0" w:noVBand="1" w:val="04A0"/>
+        <w:tblW w:w="9638" w:type="dxa"/>
+        <w:tblLayout w:type="fixed"/>
       </w:tblPr>
       <w:tblGrid>
-        <w:gridCol w:w="4819"/>
-        <w:gridCol w:w="4819"/>
+        <w:gridCol w:w="3000"/>
+        <w:gridCol w:w="6638"/>
       </w:tblGrid>
       <w:tr>
         <w:trPr>
+          <w:cantSplit/>
           <w:tblHeader/>
         </w:trPr>
         <w:tc>
@@ -535,6 +551,9 @@
         </w:tc>
       </w:tr>
       <w:tr>
+        <w:trPr>
+          <w:cantSplit/>
+        </w:trPr>
         <w:tc>
           <w:tcPr>
             <w:tcW w:type="dxa" w:w="4819"/>
@@ -589,6 +608,9 @@
         </w:tc>
       </w:tr>
       <w:tr>
+        <w:trPr>
+          <w:cantSplit/>
+        </w:trPr>
         <w:tc>
           <w:tcPr>
             <w:tcW w:type="dxa" w:w="4819"/>
@@ -739,18 +761,20 @@
     </w:p>
     <w:tbl>
       <w:tblPr>
-        <w:tblW w:type="auto" w:w="0"/>
         <w:jc w:val="center"/>
         <w:tblLook w:firstColumn="1" w:firstRow="1" w:lastColumn="0" w:lastRow="0" w:noHBand="0" w:noVBand="1" w:val="04A0"/>
+        <w:tblW w:w="9638" w:type="dxa"/>
+        <w:tblLayout w:type="fixed"/>
       </w:tblPr>
       <w:tblGrid>
-        <w:gridCol w:w="2409"/>
-        <w:gridCol w:w="2409"/>
-        <w:gridCol w:w="2409"/>
-        <w:gridCol w:w="2409"/>
+        <w:gridCol w:w="3900"/>
+        <w:gridCol w:w="2100"/>
+        <w:gridCol w:w="1300"/>
+        <w:gridCol w:w="2338"/>
       </w:tblGrid>
       <w:tr>
         <w:trPr>
+          <w:cantSplit/>
           <w:tblHeader/>
         </w:trPr>
         <w:tc>
@@ -879,6 +903,9 @@
         </w:tc>
       </w:tr>
       <w:tr>
+        <w:trPr>
+          <w:cantSplit/>
+        </w:trPr>
         <w:tc>
           <w:tcPr>
             <w:tcW w:type="dxa" w:w="2409"/>
@@ -985,6 +1012,9 @@
         </w:tc>
       </w:tr>
       <w:tr>
+        <w:trPr>
+          <w:cantSplit/>
+        </w:trPr>
         <w:tc>
           <w:tcPr>
             <w:tcW w:type="dxa" w:w="2409"/>
@@ -1291,17 +1321,19 @@
     </w:p>
     <w:tbl>
       <w:tblPr>
-        <w:tblW w:type="auto" w:w="0"/>
         <w:jc w:val="center"/>
         <w:tblLook w:firstColumn="1" w:firstRow="1" w:lastColumn="0" w:lastRow="0" w:noHBand="0" w:noVBand="1" w:val="04A0"/>
+        <w:tblW w:w="9638" w:type="dxa"/>
+        <w:tblLayout w:type="fixed"/>
       </w:tblPr>
       <w:tblGrid>
-        <w:gridCol w:w="3213"/>
-        <w:gridCol w:w="3213"/>
-        <w:gridCol w:w="3213"/>
+        <w:gridCol w:w="3400"/>
+        <w:gridCol w:w="3800"/>
+        <w:gridCol w:w="2438"/>
       </w:tblGrid>
       <w:tr>
         <w:trPr>
+          <w:cantSplit/>
           <w:tblHeader/>
         </w:trPr>
         <w:tc>
@@ -1399,6 +1431,9 @@
         </w:tc>
       </w:tr>
       <w:tr>
+        <w:trPr>
+          <w:cantSplit/>
+        </w:trPr>
         <w:tc>
           <w:tcPr>
             <w:tcW w:type="dxa" w:w="3213"/>
@@ -1482,6 +1517,9 @@
         </w:tc>
       </w:tr>
       <w:tr>
+        <w:trPr>
+          <w:cantSplit/>
+        </w:trPr>
         <w:tc>
           <w:tcPr>
             <w:tcW w:type="dxa" w:w="3213"/>
@@ -2076,16 +2114,18 @@
     </w:p>
     <w:tbl>
       <w:tblPr>
-        <w:tblW w:type="auto" w:w="0"/>
         <w:jc w:val="center"/>
         <w:tblLook w:firstColumn="1" w:firstRow="1" w:lastColumn="0" w:lastRow="0" w:noHBand="0" w:noVBand="1" w:val="04A0"/>
+        <w:tblW w:w="9638" w:type="dxa"/>
+        <w:tblLayout w:type="fixed"/>
       </w:tblPr>
       <w:tblGrid>
-        <w:gridCol w:w="4819"/>
-        <w:gridCol w:w="4819"/>
+        <w:gridCol w:w="5600"/>
+        <w:gridCol w:w="4038"/>
       </w:tblGrid>
       <w:tr>
         <w:trPr>
+          <w:cantSplit/>
           <w:tblHeader/>
         </w:trPr>
         <w:tc>
@@ -2152,6 +2192,9 @@
         </w:tc>
       </w:tr>
       <w:tr>
+        <w:trPr>
+          <w:cantSplit/>
+        </w:trPr>
         <w:tc>
           <w:tcPr>
             <w:tcW w:type="dxa" w:w="4819"/>
@@ -2209,6 +2252,9 @@
         </w:tc>
       </w:tr>
       <w:tr>
+        <w:trPr>
+          <w:cantSplit/>
+        </w:trPr>
         <w:tc>
           <w:tcPr>
             <w:tcW w:type="dxa" w:w="4819"/>
@@ -2271,6 +2317,9 @@
         </w:tc>
       </w:tr>
       <w:tr>
+        <w:trPr>
+          <w:cantSplit/>
+        </w:trPr>
         <w:tc>
           <w:tcPr>
             <w:tcW w:type="dxa" w:w="4819"/>
@@ -2626,17 +2675,19 @@
     </w:p>
     <w:tbl>
       <w:tblPr>
-        <w:tblW w:type="auto" w:w="0"/>
         <w:jc w:val="center"/>
         <w:tblLook w:firstColumn="1" w:firstRow="1" w:lastColumn="0" w:lastRow="0" w:noHBand="0" w:noVBand="1" w:val="04A0"/>
+        <w:tblW w:w="9638" w:type="dxa"/>
+        <w:tblLayout w:type="fixed"/>
       </w:tblPr>
       <w:tblGrid>
-        <w:gridCol w:w="3213"/>
-        <w:gridCol w:w="3213"/>
-        <w:gridCol w:w="3213"/>
+        <w:gridCol w:w="2000"/>
+        <w:gridCol w:w="3200"/>
+        <w:gridCol w:w="4438"/>
       </w:tblGrid>
       <w:tr>
         <w:trPr>
+          <w:cantSplit/>
           <w:tblHeader/>
         </w:trPr>
         <w:tc>
@@ -2734,6 +2785,9 @@
         </w:tc>
       </w:tr>
       <w:tr>
+        <w:trPr>
+          <w:cantSplit/>
+        </w:trPr>
         <w:tc>
           <w:tcPr>
             <w:tcW w:type="dxa" w:w="3213"/>
@@ -2814,6 +2868,9 @@
         </w:tc>
       </w:tr>
       <w:tr>
+        <w:trPr>
+          <w:cantSplit/>
+        </w:trPr>
         <w:tc>
           <w:tcPr>
             <w:tcW w:type="dxa" w:w="3213"/>
@@ -2897,6 +2954,9 @@
         </w:tc>
       </w:tr>
       <w:tr>
+        <w:trPr>
+          <w:cantSplit/>
+        </w:trPr>
         <w:tc>
           <w:tcPr>
             <w:tcW w:type="dxa" w:w="3213"/>
@@ -2977,6 +3037,9 @@
         </w:tc>
       </w:tr>
       <w:tr>
+        <w:trPr>
+          <w:cantSplit/>
+        </w:trPr>
         <w:tc>
           <w:tcPr>
             <w:tcW w:type="dxa" w:w="3213"/>
@@ -3743,16 +3806,18 @@
     </w:p>
     <w:tbl>
       <w:tblPr>
-        <w:tblW w:type="auto" w:w="0"/>
         <w:jc w:val="center"/>
         <w:tblLook w:firstColumn="1" w:firstRow="1" w:lastColumn="0" w:lastRow="0" w:noHBand="0" w:noVBand="1" w:val="04A0"/>
+        <w:tblW w:w="9638" w:type="dxa"/>
+        <w:tblLayout w:type="fixed"/>
       </w:tblPr>
       <w:tblGrid>
-        <w:gridCol w:w="4819"/>
-        <w:gridCol w:w="4819"/>
+        <w:gridCol w:w="3800"/>
+        <w:gridCol w:w="5838"/>
       </w:tblGrid>
       <w:tr>
         <w:trPr>
+          <w:cantSplit/>
           <w:tblHeader/>
         </w:trPr>
         <w:tc>
@@ -3819,6 +3884,9 @@
         </w:tc>
       </w:tr>
       <w:tr>
+        <w:trPr>
+          <w:cantSplit/>
+        </w:trPr>
         <w:tc>
           <w:tcPr>
             <w:tcW w:type="dxa" w:w="4819"/>
@@ -3876,6 +3944,9 @@
         </w:tc>
       </w:tr>
       <w:tr>
+        <w:trPr>
+          <w:cantSplit/>
+        </w:trPr>
         <w:tc>
           <w:tcPr>
             <w:tcW w:type="dxa" w:w="4819"/>
@@ -3947,6 +4018,9 @@
         </w:tc>
       </w:tr>
       <w:tr>
+        <w:trPr>
+          <w:cantSplit/>
+        </w:trPr>
         <w:tc>
           <w:tcPr>
             <w:tcW w:type="dxa" w:w="4819"/>
@@ -4001,6 +4075,9 @@
         </w:tc>
       </w:tr>
       <w:tr>
+        <w:trPr>
+          <w:cantSplit/>
+        </w:trPr>
         <w:tc>
           <w:tcPr>
             <w:tcW w:type="dxa" w:w="4819"/>
@@ -4063,6 +4140,9 @@
         </w:tc>
       </w:tr>
       <w:tr>
+        <w:trPr>
+          <w:cantSplit/>
+        </w:trPr>
         <w:tc>
           <w:tcPr>
             <w:tcW w:type="dxa" w:w="4819"/>
@@ -4117,6 +4197,9 @@
         </w:tc>
       </w:tr>
       <w:tr>
+        <w:trPr>
+          <w:cantSplit/>
+        </w:trPr>
         <w:tc>
           <w:tcPr>
             <w:tcW w:type="dxa" w:w="4819"/>
@@ -4437,16 +4520,18 @@
     </w:p>
     <w:tbl>
       <w:tblPr>
-        <w:tblW w:type="auto" w:w="0"/>
         <w:jc w:val="center"/>
         <w:tblLook w:firstColumn="1" w:firstRow="1" w:lastColumn="0" w:lastRow="0" w:noHBand="0" w:noVBand="1" w:val="04A0"/>
+        <w:tblW w:w="9638" w:type="dxa"/>
+        <w:tblLayout w:type="fixed"/>
       </w:tblPr>
       <w:tblGrid>
-        <w:gridCol w:w="4819"/>
-        <w:gridCol w:w="4819"/>
+        <w:gridCol w:w="2800"/>
+        <w:gridCol w:w="6838"/>
       </w:tblGrid>
       <w:tr>
         <w:trPr>
+          <w:cantSplit/>
           <w:tblHeader/>
         </w:trPr>
         <w:tc>
@@ -4513,6 +4598,9 @@
         </w:tc>
       </w:tr>
       <w:tr>
+        <w:trPr>
+          <w:cantSplit/>
+        </w:trPr>
         <w:tc>
           <w:tcPr>
             <w:tcW w:type="dxa" w:w="4819"/>
@@ -4576,6 +4664,9 @@
         </w:tc>
       </w:tr>
       <w:tr>
+        <w:trPr>
+          <w:cantSplit/>
+        </w:trPr>
         <w:tc>
           <w:tcPr>
             <w:tcW w:type="dxa" w:w="4819"/>
@@ -4641,6 +4732,9 @@
         </w:tc>
       </w:tr>
       <w:tr>
+        <w:trPr>
+          <w:cantSplit/>
+        </w:trPr>
         <w:tc>
           <w:tcPr>
             <w:tcW w:type="dxa" w:w="4819"/>
@@ -4704,6 +4798,9 @@
         </w:tc>
       </w:tr>
       <w:tr>
+        <w:trPr>
+          <w:cantSplit/>
+        </w:trPr>
         <w:tc>
           <w:tcPr>
             <w:tcW w:type="dxa" w:w="4819"/>
@@ -4771,17 +4868,19 @@
     </w:p>
     <w:tbl>
       <w:tblPr>
-        <w:tblW w:type="auto" w:w="0"/>
         <w:jc w:val="center"/>
         <w:tblLook w:firstColumn="1" w:firstRow="1" w:lastColumn="0" w:lastRow="0" w:noHBand="0" w:noVBand="1" w:val="04A0"/>
+        <w:tblW w:w="9638" w:type="dxa"/>
+        <w:tblLayout w:type="fixed"/>
       </w:tblPr>
       <w:tblGrid>
-        <w:gridCol w:w="3213"/>
-        <w:gridCol w:w="3213"/>
-        <w:gridCol w:w="3213"/>
+        <w:gridCol w:w="2600"/>
+        <w:gridCol w:w="3400"/>
+        <w:gridCol w:w="3638"/>
       </w:tblGrid>
       <w:tr>
         <w:trPr>
+          <w:cantSplit/>
           <w:tblHeader/>
         </w:trPr>
         <w:tc>
@@ -4879,6 +4978,9 @@
         </w:tc>
       </w:tr>
       <w:tr>
+        <w:trPr>
+          <w:cantSplit/>
+        </w:trPr>
         <w:tc>
           <w:tcPr>
             <w:tcW w:type="dxa" w:w="3213"/>
@@ -4959,6 +5061,9 @@
         </w:tc>
       </w:tr>
       <w:tr>
+        <w:trPr>
+          <w:cantSplit/>
+        </w:trPr>
         <w:tc>
           <w:tcPr>
             <w:tcW w:type="dxa" w:w="3213"/>
@@ -5042,6 +5147,9 @@
         </w:tc>
       </w:tr>
       <w:tr>
+        <w:trPr>
+          <w:cantSplit/>
+        </w:trPr>
         <w:tc>
           <w:tcPr>
             <w:tcW w:type="dxa" w:w="3213"/>
@@ -5131,6 +5239,9 @@
         </w:tc>
       </w:tr>
       <w:tr>
+        <w:trPr>
+          <w:cantSplit/>
+        </w:trPr>
         <w:tc>
           <w:tcPr>
             <w:tcW w:type="dxa" w:w="3213"/>
@@ -5214,6 +5325,9 @@
         </w:tc>
       </w:tr>
       <w:tr>
+        <w:trPr>
+          <w:cantSplit/>
+        </w:trPr>
         <w:tc>
           <w:tcPr>
             <w:tcW w:type="dxa" w:w="3213"/>
@@ -5303,6 +5417,9 @@
         </w:tc>
       </w:tr>
       <w:tr>
+        <w:trPr>
+          <w:cantSplit/>
+        </w:trPr>
         <w:tc>
           <w:tcPr>
             <w:tcW w:type="dxa" w:w="3213"/>
@@ -5535,16 +5652,18 @@
     </w:p>
     <w:tbl>
       <w:tblPr>
-        <w:tblW w:type="auto" w:w="0"/>
         <w:jc w:val="center"/>
         <w:tblLook w:firstColumn="1" w:firstRow="1" w:lastColumn="0" w:lastRow="0" w:noHBand="0" w:noVBand="1" w:val="04A0"/>
+        <w:tblW w:w="9638" w:type="dxa"/>
+        <w:tblLayout w:type="fixed"/>
       </w:tblPr>
       <w:tblGrid>
-        <w:gridCol w:w="4819"/>
-        <w:gridCol w:w="4819"/>
+        <w:gridCol w:w="3400"/>
+        <w:gridCol w:w="6238"/>
       </w:tblGrid>
       <w:tr>
         <w:trPr>
+          <w:cantSplit/>
           <w:tblHeader/>
         </w:trPr>
         <w:tc>
@@ -5611,6 +5730,9 @@
         </w:tc>
       </w:tr>
       <w:tr>
+        <w:trPr>
+          <w:cantSplit/>
+        </w:trPr>
         <w:tc>
           <w:tcPr>
             <w:tcW w:type="dxa" w:w="4819"/>
@@ -5665,6 +5787,9 @@
         </w:tc>
       </w:tr>
       <w:tr>
+        <w:trPr>
+          <w:cantSplit/>
+        </w:trPr>
         <w:tc>
           <w:tcPr>
             <w:tcW w:type="dxa" w:w="4819"/>
@@ -5721,6 +5846,9 @@
         </w:tc>
       </w:tr>
       <w:tr>
+        <w:trPr>
+          <w:cantSplit/>
+        </w:trPr>
         <w:tc>
           <w:tcPr>
             <w:tcW w:type="dxa" w:w="4819"/>
@@ -5784,6 +5912,9 @@
         </w:tc>
       </w:tr>
       <w:tr>
+        <w:trPr>
+          <w:cantSplit/>
+        </w:trPr>
         <w:tc>
           <w:tcPr>
             <w:tcW w:type="dxa" w:w="4819"/>
@@ -5840,6 +5971,9 @@
         </w:tc>
       </w:tr>
       <w:tr>
+        <w:trPr>
+          <w:cantSplit/>
+        </w:trPr>
         <w:tc>
           <w:tcPr>
             <w:tcW w:type="dxa" w:w="4819"/>
@@ -5894,6 +6028,9 @@
         </w:tc>
       </w:tr>
       <w:tr>
+        <w:trPr>
+          <w:cantSplit/>
+        </w:trPr>
         <w:tc>
           <w:tcPr>
             <w:tcW w:type="dxa" w:w="4819"/>

</xml_diff>

<commit_message>
Procedure 21 CFR, SIMATIC Logon e NTP: sommario, segnalibri, percorsi menu e impaginazione
Testo e immagini invariati rispetto alle versioni di Mattia; rimossi i paragrafi vuoti.

Co-Authored-By: Claude Opus 5.5 <noreply@anthropic.com>
Claude-Session: https://claude.ai/code/session_017FNXRGi3qa62SAS8zgzmg1
</commit_message>
<xml_diff>
--- a/Procedure/Procedura_SIMATIC_Logon.docx
+++ b/Procedure/Procedura_SIMATIC_Logon.docx
@@ -322,11 +322,893 @@
     <w:p/>
     <w:p>
       <w:pPr>
+        <w:pageBreakBefore/>
+        <w:spacing w:after="200"/>
+      </w:pPr>
+      <w:r>
+        <w:rPr>
+          <w:b/>
+          <w:color w:val="1F4E79"/>
+          <w:sz w:val="36"/>
+        </w:rPr>
+        <w:t>Sommario</w:t>
+      </w:r>
+    </w:p>
+    <w:p>
+      <w:pPr>
+        <w:tabs>
+          <w:tab w:val="right" w:leader="dot" w:pos="9638"/>
+        </w:tabs>
+        <w:spacing w:before="100" w:after="30"/>
+        <w:ind w:left="0"/>
+      </w:pPr>
+      <w:hyperlink w:anchor="_Toc001" w:history="1">
+        <w:r>
+          <w:rPr>
+            <w:b/>
+            <w:color w:val="1F4E79"/>
+            <w:sz w:val="21"/>
+          </w:rPr>
+          <w:t xml:space="preserve">1. Scopo</w:t>
+        </w:r>
+        <w:r>
+          <w:tab/>
+        </w:r>
+        <w:r>
+          <w:fldChar w:fldCharType="begin"/>
+        </w:r>
+        <w:r>
+          <w:instrText xml:space="preserve"> PAGEREF _Toc001 \h </w:instrText>
+        </w:r>
+        <w:r>
+          <w:fldChar w:fldCharType="separate"/>
+        </w:r>
+        <w:r>
+          <w:rPr>
+            <w:sz w:val="20"/>
+          </w:rPr>
+          <w:t>3</w:t>
+        </w:r>
+        <w:r>
+          <w:fldChar w:fldCharType="end"/>
+        </w:r>
+      </w:hyperlink>
+    </w:p>
+    <w:p>
+      <w:pPr>
+        <w:tabs>
+          <w:tab w:val="right" w:leader="dot" w:pos="9638"/>
+        </w:tabs>
+        <w:spacing w:before="100" w:after="30"/>
+        <w:ind w:left="0"/>
+      </w:pPr>
+      <w:hyperlink w:anchor="_Toc002" w:history="1">
+        <w:r>
+          <w:rPr>
+            <w:b/>
+            <w:color w:val="1F4E79"/>
+            <w:sz w:val="21"/>
+          </w:rPr>
+          <w:t xml:space="preserve">2. Principio di funzionamento</w:t>
+        </w:r>
+        <w:r>
+          <w:tab/>
+        </w:r>
+        <w:r>
+          <w:fldChar w:fldCharType="begin"/>
+        </w:r>
+        <w:r>
+          <w:instrText xml:space="preserve"> PAGEREF _Toc002 \h </w:instrText>
+        </w:r>
+        <w:r>
+          <w:fldChar w:fldCharType="separate"/>
+        </w:r>
+        <w:r>
+          <w:rPr>
+            <w:sz w:val="20"/>
+          </w:rPr>
+          <w:t>3</w:t>
+        </w:r>
+        <w:r>
+          <w:fldChar w:fldCharType="end"/>
+        </w:r>
+      </w:hyperlink>
+    </w:p>
+    <w:p>
+      <w:pPr>
+        <w:tabs>
+          <w:tab w:val="right" w:leader="dot" w:pos="9638"/>
+        </w:tabs>
+        <w:spacing w:before="100" w:after="30"/>
+        <w:ind w:left="0"/>
+      </w:pPr>
+      <w:hyperlink w:anchor="_Toc003" w:history="1">
+        <w:r>
+          <w:rPr>
+            <w:b/>
+            <w:color w:val="1F4E79"/>
+            <w:sz w:val="21"/>
+          </w:rPr>
+          <w:t xml:space="preserve">3. Licenze e software</w:t>
+        </w:r>
+        <w:r>
+          <w:tab/>
+        </w:r>
+        <w:r>
+          <w:fldChar w:fldCharType="begin"/>
+        </w:r>
+        <w:r>
+          <w:instrText xml:space="preserve"> PAGEREF _Toc003 \h </w:instrText>
+        </w:r>
+        <w:r>
+          <w:fldChar w:fldCharType="separate"/>
+        </w:r>
+        <w:r>
+          <w:rPr>
+            <w:sz w:val="20"/>
+          </w:rPr>
+          <w:t>4</w:t>
+        </w:r>
+        <w:r>
+          <w:fldChar w:fldCharType="end"/>
+        </w:r>
+      </w:hyperlink>
+    </w:p>
+    <w:p>
+      <w:pPr>
+        <w:tabs>
+          <w:tab w:val="right" w:leader="dot" w:pos="9638"/>
+        </w:tabs>
+        <w:spacing w:before="100" w:after="30"/>
+        <w:ind w:left="0"/>
+      </w:pPr>
+      <w:hyperlink w:anchor="_Toc004" w:history="1">
+        <w:r>
+          <w:rPr>
+            <w:b/>
+            <w:color w:val="1F4E79"/>
+            <w:sz w:val="21"/>
+          </w:rPr>
+          <w:t xml:space="preserve">4. Parte A – Lato PC / Server</w:t>
+        </w:r>
+        <w:r>
+          <w:tab/>
+        </w:r>
+        <w:r>
+          <w:fldChar w:fldCharType="begin"/>
+        </w:r>
+        <w:r>
+          <w:instrText xml:space="preserve"> PAGEREF _Toc004 \h </w:instrText>
+        </w:r>
+        <w:r>
+          <w:fldChar w:fldCharType="separate"/>
+        </w:r>
+        <w:r>
+          <w:rPr>
+            <w:sz w:val="20"/>
+          </w:rPr>
+          <w:t>5</w:t>
+        </w:r>
+        <w:r>
+          <w:fldChar w:fldCharType="end"/>
+        </w:r>
+      </w:hyperlink>
+    </w:p>
+    <w:p>
+      <w:pPr>
+        <w:tabs>
+          <w:tab w:val="right" w:leader="dot" w:pos="9638"/>
+        </w:tabs>
+        <w:spacing w:before="0" w:after="10"/>
+        <w:ind w:left="400"/>
+      </w:pPr>
+      <w:hyperlink w:anchor="_Toc005" w:history="1">
+        <w:r>
+          <w:rPr>
+            <w:color w:val="262626"/>
+            <w:sz w:val="20"/>
+          </w:rPr>
+          <w:t xml:space="preserve">4.1 Installazione di SIMATIC Logon su PC nuovo</w:t>
+        </w:r>
+        <w:r>
+          <w:tab/>
+        </w:r>
+        <w:r>
+          <w:fldChar w:fldCharType="begin"/>
+        </w:r>
+        <w:r>
+          <w:instrText xml:space="preserve"> PAGEREF _Toc005 \h </w:instrText>
+        </w:r>
+        <w:r>
+          <w:fldChar w:fldCharType="separate"/>
+        </w:r>
+        <w:r>
+          <w:rPr>
+            <w:sz w:val="20"/>
+          </w:rPr>
+          <w:t>5</w:t>
+        </w:r>
+        <w:r>
+          <w:fldChar w:fldCharType="end"/>
+        </w:r>
+      </w:hyperlink>
+    </w:p>
+    <w:p>
+      <w:pPr>
+        <w:tabs>
+          <w:tab w:val="right" w:leader="dot" w:pos="9638"/>
+        </w:tabs>
+        <w:spacing w:before="0" w:after="10"/>
+        <w:ind w:left="400"/>
+      </w:pPr>
+      <w:hyperlink w:anchor="_Toc006" w:history="1">
+        <w:r>
+          <w:rPr>
+            <w:color w:val="262626"/>
+            <w:sz w:val="20"/>
+          </w:rPr>
+          <w:t xml:space="preserve">4.2 Criteri di sicurezza locali</w:t>
+        </w:r>
+        <w:r>
+          <w:tab/>
+        </w:r>
+        <w:r>
+          <w:fldChar w:fldCharType="begin"/>
+        </w:r>
+        <w:r>
+          <w:instrText xml:space="preserve"> PAGEREF _Toc006 \h </w:instrText>
+        </w:r>
+        <w:r>
+          <w:fldChar w:fldCharType="separate"/>
+        </w:r>
+        <w:r>
+          <w:rPr>
+            <w:sz w:val="20"/>
+          </w:rPr>
+          <w:t>5</w:t>
+        </w:r>
+        <w:r>
+          <w:fldChar w:fldCharType="end"/>
+        </w:r>
+      </w:hyperlink>
+    </w:p>
+    <w:p>
+      <w:pPr>
+        <w:tabs>
+          <w:tab w:val="right" w:leader="dot" w:pos="9638"/>
+        </w:tabs>
+        <w:spacing w:before="0" w:after="10"/>
+        <w:ind w:left="400"/>
+      </w:pPr>
+      <w:hyperlink w:anchor="_Toc007" w:history="1">
+        <w:r>
+          <w:rPr>
+            <w:color w:val="262626"/>
+            <w:sz w:val="20"/>
+          </w:rPr>
+          <w:t xml:space="preserve">4.3 Utente amministratore di SIMATIC Logon</w:t>
+        </w:r>
+        <w:r>
+          <w:tab/>
+        </w:r>
+        <w:r>
+          <w:fldChar w:fldCharType="begin"/>
+        </w:r>
+        <w:r>
+          <w:instrText xml:space="preserve"> PAGEREF _Toc007 \h </w:instrText>
+        </w:r>
+        <w:r>
+          <w:fldChar w:fldCharType="separate"/>
+        </w:r>
+        <w:r>
+          <w:rPr>
+            <w:sz w:val="20"/>
+          </w:rPr>
+          <w:t>5</w:t>
+        </w:r>
+        <w:r>
+          <w:fldChar w:fldCharType="end"/>
+        </w:r>
+      </w:hyperlink>
+    </w:p>
+    <w:p>
+      <w:pPr>
+        <w:tabs>
+          <w:tab w:val="right" w:leader="dot" w:pos="9638"/>
+        </w:tabs>
+        <w:spacing w:before="0" w:after="10"/>
+        <w:ind w:left="400"/>
+      </w:pPr>
+      <w:hyperlink w:anchor="_Toc008" w:history="1">
+        <w:r>
+          <w:rPr>
+            <w:color w:val="262626"/>
+            <w:sz w:val="20"/>
+          </w:rPr>
+          <w:t xml:space="preserve">4.4 Configurazione di SIMATIC Logon</w:t>
+        </w:r>
+        <w:r>
+          <w:tab/>
+        </w:r>
+        <w:r>
+          <w:fldChar w:fldCharType="begin"/>
+        </w:r>
+        <w:r>
+          <w:instrText xml:space="preserve"> PAGEREF _Toc008 \h </w:instrText>
+        </w:r>
+        <w:r>
+          <w:fldChar w:fldCharType="separate"/>
+        </w:r>
+        <w:r>
+          <w:rPr>
+            <w:sz w:val="20"/>
+          </w:rPr>
+          <w:t>6</w:t>
+        </w:r>
+        <w:r>
+          <w:fldChar w:fldCharType="end"/>
+        </w:r>
+      </w:hyperlink>
+    </w:p>
+    <w:p>
+      <w:pPr>
+        <w:tabs>
+          <w:tab w:val="right" w:leader="dot" w:pos="9638"/>
+        </w:tabs>
+        <w:spacing w:before="0" w:after="10"/>
+        <w:ind w:left="400"/>
+      </w:pPr>
+      <w:hyperlink w:anchor="_Toc009" w:history="1">
+        <w:r>
+          <w:rPr>
+            <w:color w:val="262626"/>
+            <w:sz w:val="20"/>
+          </w:rPr>
+          <w:t xml:space="preserve">4.5 Creazione dei gruppi</w:t>
+        </w:r>
+        <w:r>
+          <w:tab/>
+        </w:r>
+        <w:r>
+          <w:fldChar w:fldCharType="begin"/>
+        </w:r>
+        <w:r>
+          <w:instrText xml:space="preserve"> PAGEREF _Toc009 \h </w:instrText>
+        </w:r>
+        <w:r>
+          <w:fldChar w:fldCharType="separate"/>
+        </w:r>
+        <w:r>
+          <w:rPr>
+            <w:sz w:val="20"/>
+          </w:rPr>
+          <w:t>7</w:t>
+        </w:r>
+        <w:r>
+          <w:fldChar w:fldCharType="end"/>
+        </w:r>
+      </w:hyperlink>
+    </w:p>
+    <w:p>
+      <w:pPr>
+        <w:tabs>
+          <w:tab w:val="right" w:leader="dot" w:pos="9638"/>
+        </w:tabs>
+        <w:spacing w:before="0" w:after="10"/>
+        <w:ind w:left="400"/>
+      </w:pPr>
+      <w:hyperlink w:anchor="_Toc010" w:history="1">
+        <w:r>
+          <w:rPr>
+            <w:color w:val="262626"/>
+            <w:sz w:val="20"/>
+          </w:rPr>
+          <w:t xml:space="preserve">4.6 Creazione degli utenti</w:t>
+        </w:r>
+        <w:r>
+          <w:tab/>
+        </w:r>
+        <w:r>
+          <w:fldChar w:fldCharType="begin"/>
+        </w:r>
+        <w:r>
+          <w:instrText xml:space="preserve"> PAGEREF _Toc010 \h </w:instrText>
+        </w:r>
+        <w:r>
+          <w:fldChar w:fldCharType="separate"/>
+        </w:r>
+        <w:r>
+          <w:rPr>
+            <w:sz w:val="20"/>
+          </w:rPr>
+          <w:t>8</w:t>
+        </w:r>
+        <w:r>
+          <w:fldChar w:fldCharType="end"/>
+        </w:r>
+      </w:hyperlink>
+    </w:p>
+    <w:p>
+      <w:pPr>
+        <w:tabs>
+          <w:tab w:val="right" w:leader="dot" w:pos="9638"/>
+        </w:tabs>
+        <w:spacing w:before="0" w:after="10"/>
+        <w:ind w:left="400"/>
+      </w:pPr>
+      <w:hyperlink w:anchor="_Toc011" w:history="1">
+        <w:r>
+          <w:rPr>
+            <w:color w:val="262626"/>
+            <w:sz w:val="20"/>
+          </w:rPr>
+          <w:t xml:space="preserve">4.7 Trasferimento delle licenze</w:t>
+        </w:r>
+        <w:r>
+          <w:tab/>
+        </w:r>
+        <w:r>
+          <w:fldChar w:fldCharType="begin"/>
+        </w:r>
+        <w:r>
+          <w:instrText xml:space="preserve"> PAGEREF _Toc011 \h </w:instrText>
+        </w:r>
+        <w:r>
+          <w:fldChar w:fldCharType="separate"/>
+        </w:r>
+        <w:r>
+          <w:rPr>
+            <w:sz w:val="20"/>
+          </w:rPr>
+          <w:t>8</w:t>
+        </w:r>
+        <w:r>
+          <w:fldChar w:fldCharType="end"/>
+        </w:r>
+      </w:hyperlink>
+    </w:p>
+    <w:p>
+      <w:pPr>
+        <w:tabs>
+          <w:tab w:val="right" w:leader="dot" w:pos="9638"/>
+        </w:tabs>
+        <w:spacing w:before="0" w:after="10"/>
+        <w:ind w:left="400"/>
+      </w:pPr>
+      <w:hyperlink w:anchor="_Toc012" w:history="1">
+        <w:r>
+          <w:rPr>
+            <w:color w:val="262626"/>
+            <w:sz w:val="20"/>
+          </w:rPr>
+          <w:t xml:space="preserve">4.8 Server di prova su macchina virtuale</w:t>
+        </w:r>
+        <w:r>
+          <w:tab/>
+        </w:r>
+        <w:r>
+          <w:fldChar w:fldCharType="begin"/>
+        </w:r>
+        <w:r>
+          <w:instrText xml:space="preserve"> PAGEREF _Toc012 \h </w:instrText>
+        </w:r>
+        <w:r>
+          <w:fldChar w:fldCharType="separate"/>
+        </w:r>
+        <w:r>
+          <w:rPr>
+            <w:sz w:val="20"/>
+          </w:rPr>
+          <w:t>9</w:t>
+        </w:r>
+        <w:r>
+          <w:fldChar w:fldCharType="end"/>
+        </w:r>
+      </w:hyperlink>
+    </w:p>
+    <w:p>
+      <w:pPr>
+        <w:tabs>
+          <w:tab w:val="right" w:leader="dot" w:pos="9638"/>
+        </w:tabs>
+        <w:spacing w:before="0" w:after="10"/>
+        <w:ind w:left="400"/>
+      </w:pPr>
+      <w:hyperlink w:anchor="_Toc013" w:history="1">
+        <w:r>
+          <w:rPr>
+            <w:color w:val="262626"/>
+            <w:sz w:val="20"/>
+          </w:rPr>
+          <w:t xml:space="preserve">4.9 Monitoraggio degli accessi</w:t>
+        </w:r>
+        <w:r>
+          <w:tab/>
+        </w:r>
+        <w:r>
+          <w:fldChar w:fldCharType="begin"/>
+        </w:r>
+        <w:r>
+          <w:instrText xml:space="preserve"> PAGEREF _Toc013 \h </w:instrText>
+        </w:r>
+        <w:r>
+          <w:fldChar w:fldCharType="separate"/>
+        </w:r>
+        <w:r>
+          <w:rPr>
+            <w:sz w:val="20"/>
+          </w:rPr>
+          <w:t>11</w:t>
+        </w:r>
+        <w:r>
+          <w:fldChar w:fldCharType="end"/>
+        </w:r>
+      </w:hyperlink>
+    </w:p>
+    <w:p>
+      <w:pPr>
+        <w:tabs>
+          <w:tab w:val="right" w:leader="dot" w:pos="9638"/>
+        </w:tabs>
+        <w:spacing w:before="100" w:after="30"/>
+        <w:ind w:left="0"/>
+      </w:pPr>
+      <w:hyperlink w:anchor="_Toc014" w:history="1">
+        <w:r>
+          <w:rPr>
+            <w:b/>
+            <w:color w:val="1F4E79"/>
+            <w:sz w:val="21"/>
+          </w:rPr>
+          <w:t xml:space="preserve">5. Parte B – Lato Pannello (progetto HMI)</w:t>
+        </w:r>
+        <w:r>
+          <w:tab/>
+        </w:r>
+        <w:r>
+          <w:fldChar w:fldCharType="begin"/>
+        </w:r>
+        <w:r>
+          <w:instrText xml:space="preserve"> PAGEREF _Toc014 \h </w:instrText>
+        </w:r>
+        <w:r>
+          <w:fldChar w:fldCharType="separate"/>
+        </w:r>
+        <w:r>
+          <w:rPr>
+            <w:sz w:val="20"/>
+          </w:rPr>
+          <w:t>12</w:t>
+        </w:r>
+        <w:r>
+          <w:fldChar w:fldCharType="end"/>
+        </w:r>
+      </w:hyperlink>
+    </w:p>
+    <w:p>
+      <w:pPr>
+        <w:tabs>
+          <w:tab w:val="right" w:leader="dot" w:pos="9638"/>
+        </w:tabs>
+        <w:spacing w:before="0" w:after="10"/>
+        <w:ind w:left="400"/>
+      </w:pPr>
+      <w:hyperlink w:anchor="_Toc015" w:history="1">
+        <w:r>
+          <w:rPr>
+            <w:color w:val="262626"/>
+            <w:sz w:val="20"/>
+          </w:rPr>
+          <w:t xml:space="preserve">5.1 Attivazione di SIMATIC Logon</w:t>
+        </w:r>
+        <w:r>
+          <w:tab/>
+        </w:r>
+        <w:r>
+          <w:fldChar w:fldCharType="begin"/>
+        </w:r>
+        <w:r>
+          <w:instrText xml:space="preserve"> PAGEREF _Toc015 \h </w:instrText>
+        </w:r>
+        <w:r>
+          <w:fldChar w:fldCharType="separate"/>
+        </w:r>
+        <w:r>
+          <w:rPr>
+            <w:sz w:val="20"/>
+          </w:rPr>
+          <w:t>12</w:t>
+        </w:r>
+        <w:r>
+          <w:fldChar w:fldCharType="end"/>
+        </w:r>
+      </w:hyperlink>
+    </w:p>
+    <w:p>
+      <w:pPr>
+        <w:tabs>
+          <w:tab w:val="right" w:leader="dot" w:pos="9638"/>
+        </w:tabs>
+        <w:spacing w:before="0" w:after="10"/>
+        <w:ind w:left="400"/>
+      </w:pPr>
+      <w:hyperlink w:anchor="_Toc016" w:history="1">
+        <w:r>
+          <w:rPr>
+            <w:color w:val="262626"/>
+            <w:sz w:val="20"/>
+          </w:rPr>
+          <w:t xml:space="preserve">5.2 Gruppi e autorizzazioni</w:t>
+        </w:r>
+        <w:r>
+          <w:tab/>
+        </w:r>
+        <w:r>
+          <w:fldChar w:fldCharType="begin"/>
+        </w:r>
+        <w:r>
+          <w:instrText xml:space="preserve"> PAGEREF _Toc016 \h </w:instrText>
+        </w:r>
+        <w:r>
+          <w:fldChar w:fldCharType="separate"/>
+        </w:r>
+        <w:r>
+          <w:rPr>
+            <w:sz w:val="20"/>
+          </w:rPr>
+          <w:t>13</w:t>
+        </w:r>
+        <w:r>
+          <w:fldChar w:fldCharType="end"/>
+        </w:r>
+      </w:hyperlink>
+    </w:p>
+    <w:p>
+      <w:pPr>
+        <w:tabs>
+          <w:tab w:val="right" w:leader="dot" w:pos="9638"/>
+        </w:tabs>
+        <w:spacing w:before="0" w:after="10"/>
+        <w:ind w:left="400"/>
+      </w:pPr>
+      <w:hyperlink w:anchor="_Toc017" w:history="1">
+        <w:r>
+          <w:rPr>
+            <w:color w:val="262626"/>
+            <w:sz w:val="20"/>
+          </w:rPr>
+          <w:t xml:space="preserve">5.3 Tempo di disconnessione automatica</w:t>
+        </w:r>
+        <w:r>
+          <w:tab/>
+        </w:r>
+        <w:r>
+          <w:fldChar w:fldCharType="begin"/>
+        </w:r>
+        <w:r>
+          <w:instrText xml:space="preserve"> PAGEREF _Toc017 \h </w:instrText>
+        </w:r>
+        <w:r>
+          <w:fldChar w:fldCharType="separate"/>
+        </w:r>
+        <w:r>
+          <w:rPr>
+            <w:sz w:val="20"/>
+          </w:rPr>
+          <w:t>13</w:t>
+        </w:r>
+        <w:r>
+          <w:fldChar w:fldCharType="end"/>
+        </w:r>
+      </w:hyperlink>
+    </w:p>
+    <w:p>
+      <w:pPr>
+        <w:tabs>
+          <w:tab w:val="right" w:leader="dot" w:pos="9638"/>
+        </w:tabs>
+        <w:spacing w:before="0" w:after="10"/>
+        <w:ind w:left="400"/>
+      </w:pPr>
+      <w:hyperlink w:anchor="_Toc018" w:history="1">
+        <w:r>
+          <w:rPr>
+            <w:color w:val="262626"/>
+            <w:sz w:val="20"/>
+          </w:rPr>
+          <w:t xml:space="preserve">5.4 Comportamento con server collegato / scollegato</w:t>
+        </w:r>
+        <w:r>
+          <w:tab/>
+        </w:r>
+        <w:r>
+          <w:fldChar w:fldCharType="begin"/>
+        </w:r>
+        <w:r>
+          <w:instrText xml:space="preserve"> PAGEREF _Toc018 \h </w:instrText>
+        </w:r>
+        <w:r>
+          <w:fldChar w:fldCharType="separate"/>
+        </w:r>
+        <w:r>
+          <w:rPr>
+            <w:sz w:val="20"/>
+          </w:rPr>
+          <w:t>13</w:t>
+        </w:r>
+        <w:r>
+          <w:fldChar w:fldCharType="end"/>
+        </w:r>
+      </w:hyperlink>
+    </w:p>
+    <w:p>
+      <w:pPr>
+        <w:tabs>
+          <w:tab w:val="right" w:leader="dot" w:pos="9638"/>
+        </w:tabs>
+        <w:spacing w:before="0" w:after="10"/>
+        <w:ind w:left="400"/>
+      </w:pPr>
+      <w:hyperlink w:anchor="_Toc019" w:history="1">
+        <w:r>
+          <w:rPr>
+            <w:color w:val="262626"/>
+            <w:sz w:val="20"/>
+          </w:rPr>
+          <w:t xml:space="preserve">5.5 Differenze tra pannello e Panel PC</w:t>
+        </w:r>
+        <w:r>
+          <w:tab/>
+        </w:r>
+        <w:r>
+          <w:fldChar w:fldCharType="begin"/>
+        </w:r>
+        <w:r>
+          <w:instrText xml:space="preserve"> PAGEREF _Toc019 \h </w:instrText>
+        </w:r>
+        <w:r>
+          <w:fldChar w:fldCharType="separate"/>
+        </w:r>
+        <w:r>
+          <w:rPr>
+            <w:sz w:val="20"/>
+          </w:rPr>
+          <w:t>14</w:t>
+        </w:r>
+        <w:r>
+          <w:fldChar w:fldCharType="end"/>
+        </w:r>
+      </w:hyperlink>
+    </w:p>
+    <w:p>
+      <w:pPr>
+        <w:tabs>
+          <w:tab w:val="right" w:leader="dot" w:pos="9638"/>
+        </w:tabs>
+        <w:spacing w:before="100" w:after="30"/>
+        <w:ind w:left="0"/>
+      </w:pPr>
+      <w:hyperlink w:anchor="_Toc020" w:history="1">
+        <w:r>
+          <w:rPr>
+            <w:b/>
+            <w:color w:val="1F4E79"/>
+            <w:sz w:val="21"/>
+          </w:rPr>
+          <w:t xml:space="preserve">6. Verifica del funzionamento</w:t>
+        </w:r>
+        <w:r>
+          <w:tab/>
+        </w:r>
+        <w:r>
+          <w:fldChar w:fldCharType="begin"/>
+        </w:r>
+        <w:r>
+          <w:instrText xml:space="preserve"> PAGEREF _Toc020 \h </w:instrText>
+        </w:r>
+        <w:r>
+          <w:fldChar w:fldCharType="separate"/>
+        </w:r>
+        <w:r>
+          <w:rPr>
+            <w:sz w:val="20"/>
+          </w:rPr>
+          <w:t>14</w:t>
+        </w:r>
+        <w:r>
+          <w:fldChar w:fldCharType="end"/>
+        </w:r>
+      </w:hyperlink>
+    </w:p>
+    <w:p>
+      <w:pPr>
+        <w:tabs>
+          <w:tab w:val="right" w:leader="dot" w:pos="9638"/>
+        </w:tabs>
+        <w:spacing w:before="0" w:after="10"/>
+        <w:ind w:left="400"/>
+      </w:pPr>
+      <w:hyperlink w:anchor="_Toc021" w:history="1">
+        <w:r>
+          <w:rPr>
+            <w:color w:val="262626"/>
+            <w:sz w:val="20"/>
+          </w:rPr>
+          <w:t xml:space="preserve">6.1 Problemi frequenti</w:t>
+        </w:r>
+        <w:r>
+          <w:tab/>
+        </w:r>
+        <w:r>
+          <w:fldChar w:fldCharType="begin"/>
+        </w:r>
+        <w:r>
+          <w:instrText xml:space="preserve"> PAGEREF _Toc021 \h </w:instrText>
+        </w:r>
+        <w:r>
+          <w:fldChar w:fldCharType="separate"/>
+        </w:r>
+        <w:r>
+          <w:rPr>
+            <w:sz w:val="20"/>
+          </w:rPr>
+          <w:t>14</w:t>
+        </w:r>
+        <w:r>
+          <w:fldChar w:fldCharType="end"/>
+        </w:r>
+      </w:hyperlink>
+    </w:p>
+    <w:p>
+      <w:pPr>
+        <w:tabs>
+          <w:tab w:val="right" w:leader="dot" w:pos="9638"/>
+        </w:tabs>
+        <w:spacing w:before="100" w:after="30"/>
+        <w:ind w:left="0"/>
+      </w:pPr>
+      <w:hyperlink w:anchor="_Toc022" w:history="1">
+        <w:r>
+          <w:rPr>
+            <w:b/>
+            <w:color w:val="1F4E79"/>
+            <w:sz w:val="21"/>
+          </w:rPr>
+          <w:t xml:space="preserve">7. Messa in servizio presso il cliente</w:t>
+        </w:r>
+        <w:r>
+          <w:tab/>
+        </w:r>
+        <w:r>
+          <w:fldChar w:fldCharType="begin"/>
+        </w:r>
+        <w:r>
+          <w:instrText xml:space="preserve"> PAGEREF _Toc022 \h </w:instrText>
+        </w:r>
+        <w:r>
+          <w:fldChar w:fldCharType="separate"/>
+        </w:r>
+        <w:r>
+          <w:rPr>
+            <w:sz w:val="20"/>
+          </w:rPr>
+          <w:t>15</w:t>
+        </w:r>
+        <w:r>
+          <w:fldChar w:fldCharType="end"/>
+        </w:r>
+      </w:hyperlink>
+    </w:p>
+    <w:p>
+      <w:pPr>
         <w:pStyle w:val="Titolo1"/>
-      </w:pPr>
+        <w:pageBreakBefore/>
+      </w:pPr>
+      <w:bookmarkStart w:id="9000" w:name="_Toc001"/>
       <w:r>
         <w:t>1. Scopo</w:t>
       </w:r>
+      <w:bookmarkEnd w:id="9000"/>
     </w:p>
     <w:p>
       <w:r>
@@ -413,9 +1295,11 @@
       <w:pPr>
         <w:pStyle w:val="Titolo1"/>
       </w:pPr>
+      <w:bookmarkStart w:id="9001" w:name="_Toc002"/>
       <w:r>
         <w:t>2. Principio di funzionamento</w:t>
       </w:r>
+      <w:bookmarkEnd w:id="9001"/>
     </w:p>
     <w:p>
       <w:pPr>
@@ -638,6 +1522,7 @@
     <w:p>
       <w:pPr>
         <w:keepNext/>
+        <w:spacing w:before="240"/>
         <w:jc w:val="center"/>
       </w:pPr>
       <w:r>
@@ -647,7 +1532,7 @@
         <w:lastRenderedPageBreak/>
         <w:drawing>
           <wp:inline distT="0" distB="0" distL="0" distR="0" wp14:anchorId="02A3B4D7" wp14:editId="5D5D423E">
-            <wp:extent cx="5580000" cy="3959406"/>
+            <wp:extent cx="4058790" cy="2880000"/>
             <wp:effectExtent l="0" t="0" r="0" b="0"/>
             <wp:docPr id="1" name="Picture 1"/>
             <wp:cNvGraphicFramePr>
@@ -669,7 +1554,7 @@
                   <pic:spPr>
                     <a:xfrm>
                       <a:off x="0" y="0"/>
-                      <a:ext cx="5580000" cy="3959406"/>
+                      <a:ext cx="4058790" cy="2880000"/>
                     </a:xfrm>
                     <a:prstGeom prst="rect">
                       <a:avLst/>
@@ -734,9 +1619,11 @@
       <w:pPr>
         <w:pStyle w:val="Titolo1"/>
       </w:pPr>
+      <w:bookmarkStart w:id="9002" w:name="_Toc003"/>
       <w:r>
         <w:t>3. Licenze e software</w:t>
       </w:r>
+      <w:bookmarkEnd w:id="9002"/>
     </w:p>
     <w:tbl>
       <w:tblPr>
@@ -1149,10 +2036,12 @@
       <w:pPr>
         <w:pStyle w:val="Titolo1"/>
       </w:pPr>
+      <w:bookmarkStart w:id="9003" w:name="_Toc004"/>
       <w:r>
         <w:lastRenderedPageBreak/>
         <w:t>4. Parte A – Lato PC / Server</w:t>
       </w:r>
+      <w:bookmarkEnd w:id="9003"/>
     </w:p>
     <w:p>
       <w:r>
@@ -1172,9 +2061,11 @@
       <w:pPr>
         <w:pStyle w:val="Titolo2"/>
       </w:pPr>
+      <w:bookmarkStart w:id="9004" w:name="_Toc005"/>
       <w:r>
         <w:t>4.1 Installazione di SIMATIC Logon su PC nuovo</w:t>
       </w:r>
+      <w:bookmarkEnd w:id="9004"/>
     </w:p>
     <w:p>
       <w:pPr>
@@ -1250,25 +2141,111 @@
       <w:pPr>
         <w:pStyle w:val="Titolo2"/>
       </w:pPr>
+      <w:bookmarkStart w:id="9005" w:name="_Toc006"/>
       <w:r>
         <w:t>4.2 Criteri di sicurezza locali</w:t>
       </w:r>
-    </w:p>
-    <w:p>
-      <w:r>
+      <w:bookmarkEnd w:id="9005"/>
+    </w:p>
+    <w:p>
+      <w:r>
+        <w:rPr/>
         <w:t xml:space="preserve">Aprire </w:t>
       </w:r>
       <w:r>
         <w:rPr>
           <w:b/>
-        </w:rPr>
-        <w:t>Pannello di controllo → Strumenti di amministrazione → Criteri di sicurezza locali → Criteri account</w:t>
-      </w:r>
-      <w:r>
+          <w:color w:val="1F4E79"/>
+          <w:shd w:val="clear" w:color="auto" w:fill="E3EDF7"/>
+        </w:rPr>
+        <w:t>Pannello di controllo</w:t>
+      </w:r>
+      <w:r>
+        <w:rPr>
+          <w:b/>
+        </w:rPr>
+        <w:t xml:space="preserve"> </w:t>
+      </w:r>
+      <w:r>
+        <w:rPr>
+          <w:b/>
+          <w:color w:val="1F4E79"/>
+        </w:rPr>
+        <w:t>→</w:t>
+      </w:r>
+      <w:r>
+        <w:rPr>
+          <w:b/>
+        </w:rPr>
+        <w:t xml:space="preserve"> </w:t>
+      </w:r>
+      <w:r>
+        <w:rPr>
+          <w:b/>
+          <w:color w:val="1F4E79"/>
+          <w:shd w:val="clear" w:color="auto" w:fill="E3EDF7"/>
+        </w:rPr>
+        <w:t>Strumenti di amministrazione</w:t>
+      </w:r>
+      <w:r>
+        <w:rPr>
+          <w:b/>
+        </w:rPr>
+        <w:t xml:space="preserve"> </w:t>
+      </w:r>
+      <w:r>
+        <w:rPr>
+          <w:b/>
+          <w:color w:val="1F4E79"/>
+        </w:rPr>
+        <w:t>→</w:t>
+      </w:r>
+      <w:r>
+        <w:rPr>
+          <w:b/>
+        </w:rPr>
+        <w:t xml:space="preserve"> </w:t>
+      </w:r>
+      <w:r>
+        <w:rPr>
+          <w:b/>
+          <w:color w:val="1F4E79"/>
+          <w:shd w:val="clear" w:color="auto" w:fill="E3EDF7"/>
+        </w:rPr>
+        <w:t>Criteri di sicurezza locali</w:t>
+      </w:r>
+      <w:r>
+        <w:rPr>
+          <w:b/>
+        </w:rPr>
+        <w:t xml:space="preserve"> </w:t>
+      </w:r>
+      <w:r>
+        <w:rPr>
+          <w:b/>
+          <w:color w:val="1F4E79"/>
+        </w:rPr>
+        <w:t>→</w:t>
+      </w:r>
+      <w:r>
+        <w:rPr>
+          <w:b/>
+        </w:rPr>
+        <w:t xml:space="preserve"> </w:t>
+      </w:r>
+      <w:r>
+        <w:rPr>
+          <w:b/>
+          <w:color w:val="1F4E79"/>
+          <w:shd w:val="clear" w:color="auto" w:fill="E3EDF7"/>
+        </w:rPr>
+        <w:t>Criteri account</w:t>
+      </w:r>
+      <w:r>
+        <w:rPr/>
         <w:t xml:space="preserve"> e impostare:</w:t>
       </w:r>
     </w:p>
-    <w:p/>
     <w:tbl>
       <w:tblPr>
         <w:tblW w:w="0" w:type="auto"/>
@@ -1539,6 +2516,7 @@
     <w:p>
       <w:pPr>
         <w:keepNext/>
+        <w:spacing w:before="240"/>
         <w:jc w:val="center"/>
       </w:pPr>
       <w:r>
@@ -1547,7 +2525,7 @@
         </w:rPr>
         <w:drawing>
           <wp:inline distT="0" distB="0" distL="0" distR="0" wp14:anchorId="1E5CA111" wp14:editId="4200542B">
-            <wp:extent cx="6120130" cy="3244215"/>
+            <wp:extent cx="5040000" cy="2671649"/>
             <wp:effectExtent l="0" t="0" r="0" b="0"/>
             <wp:docPr id="1058110143" name="Immagine 1"/>
             <wp:cNvGraphicFramePr>
@@ -1569,7 +2547,7 @@
                   <pic:spPr>
                     <a:xfrm>
                       <a:off x="0" y="0"/>
-                      <a:ext cx="6120130" cy="3244215"/>
+                      <a:ext cx="5040000" cy="2671649"/>
                     </a:xfrm>
                     <a:prstGeom prst="rect">
                       <a:avLst/>
@@ -1625,21 +2603,81 @@
       <w:pPr>
         <w:pStyle w:val="Titolo2"/>
       </w:pPr>
+      <w:bookmarkStart w:id="9006" w:name="_Toc007"/>
       <w:r>
         <w:t>4.3 Utente amministratore di SIMATIC Logon</w:t>
       </w:r>
-    </w:p>
-    <w:p>
-      <w:r>
+      <w:bookmarkEnd w:id="9006"/>
+    </w:p>
+    <w:p>
+      <w:r>
+        <w:rPr/>
         <w:t xml:space="preserve">Serve un utente che possa aprire la configurazione di SIMATIC Logon. Aprire </w:t>
       </w:r>
       <w:r>
         <w:rPr>
           <w:b/>
-        </w:rPr>
-        <w:t>tasto destro su Computer → Gestione → Utenti e gruppi locali</w:t>
-      </w:r>
-      <w:r>
+          <w:color w:val="1F4E79"/>
+          <w:shd w:val="clear" w:color="auto" w:fill="E3EDF7"/>
+        </w:rPr>
+        <w:t>tasto destro su Computer</w:t>
+      </w:r>
+      <w:r>
+        <w:rPr>
+          <w:b/>
+        </w:rPr>
+        <w:t xml:space="preserve"> </w:t>
+      </w:r>
+      <w:r>
+        <w:rPr>
+          <w:b/>
+          <w:color w:val="1F4E79"/>
+        </w:rPr>
+        <w:t>→</w:t>
+      </w:r>
+      <w:r>
+        <w:rPr>
+          <w:b/>
+        </w:rPr>
+        <w:t xml:space="preserve"> </w:t>
+      </w:r>
+      <w:r>
+        <w:rPr>
+          <w:b/>
+          <w:color w:val="1F4E79"/>
+          <w:shd w:val="clear" w:color="auto" w:fill="E3EDF7"/>
+        </w:rPr>
+        <w:t>Gestione</w:t>
+      </w:r>
+      <w:r>
+        <w:rPr>
+          <w:b/>
+        </w:rPr>
+        <w:t xml:space="preserve"> </w:t>
+      </w:r>
+      <w:r>
+        <w:rPr>
+          <w:b/>
+          <w:color w:val="1F4E79"/>
+        </w:rPr>
+        <w:t>→</w:t>
+      </w:r>
+      <w:r>
+        <w:rPr>
+          <w:b/>
+        </w:rPr>
+        <w:t xml:space="preserve"> </w:t>
+      </w:r>
+      <w:r>
+        <w:rPr>
+          <w:b/>
+          <w:color w:val="1F4E79"/>
+          <w:shd w:val="clear" w:color="auto" w:fill="E3EDF7"/>
+        </w:rPr>
+        <w:t>Utenti e gruppi locali</w:t>
+      </w:r>
+      <w:r>
+        <w:rPr/>
         <w:t>.</w:t>
       </w:r>
     </w:p>
@@ -1719,6 +2757,7 @@
     <w:p>
       <w:pPr>
         <w:pStyle w:val="Paragrafoelenco"/>
+        <w:keepNext/>
         <w:numPr>
           <w:ilvl w:val="0"/>
           <w:numId w:val="10"/>
@@ -1769,171 +2808,190 @@
         <w:t xml:space="preserve"> (Siemens), più il gruppo HMI che deve avere (es. Operator).</w:t>
       </w:r>
     </w:p>
-    <w:p>
-      <w:pPr>
-        <w:pStyle w:val="Paragrafoelenco"/>
-        <w:ind w:left="540"/>
-      </w:pPr>
-    </w:p>
-    <w:p>
-      <w:pPr>
-        <w:keepNext/>
+    <w:tbl>
+      <w:tblPr>
+        <w:tblW w:type="auto" w:w="0"/>
+        <w:tblLook w:firstColumn="1" w:firstRow="1" w:lastColumn="0" w:lastRow="0" w:noHBand="0" w:noVBand="1" w:val="04A0"/>
         <w:jc w:val="center"/>
-      </w:pPr>
-      <w:r>
-        <w:rPr>
-          <w:noProof/>
-        </w:rPr>
-        <w:drawing>
-          <wp:inline distT="0" distB="0" distL="0" distR="0" wp14:anchorId="5B5DE5B7" wp14:editId="3C427718">
-            <wp:extent cx="3060000" cy="3442500"/>
-            <wp:effectExtent l="0" t="0" r="0" b="0"/>
-            <wp:docPr id="3" name="Picture 3"/>
-            <wp:cNvGraphicFramePr>
-              <a:graphicFrameLocks xmlns:a="http://schemas.openxmlformats.org/drawingml/2006/main" noChangeAspect="1"/>
-            </wp:cNvGraphicFramePr>
-            <a:graphic xmlns:a="http://schemas.openxmlformats.org/drawingml/2006/main">
-              <a:graphicData uri="http://schemas.openxmlformats.org/drawingml/2006/picture">
-                <pic:pic xmlns:pic="http://schemas.openxmlformats.org/drawingml/2006/picture">
-                  <pic:nvPicPr>
-                    <pic:cNvPr id="0" name="image.png"/>
-                    <pic:cNvPicPr/>
-                  </pic:nvPicPr>
-                  <pic:blipFill>
-                    <a:blip r:embed="rId9"/>
-                    <a:stretch>
-                      <a:fillRect/>
-                    </a:stretch>
-                  </pic:blipFill>
-                  <pic:spPr>
-                    <a:xfrm>
-                      <a:off x="0" y="0"/>
-                      <a:ext cx="3060000" cy="3442500"/>
-                    </a:xfrm>
-                    <a:prstGeom prst="rect">
-                      <a:avLst/>
-                    </a:prstGeom>
-                  </pic:spPr>
-                </pic:pic>
-              </a:graphicData>
-            </a:graphic>
-          </wp:inline>
-        </w:drawing>
-      </w:r>
-    </w:p>
-    <w:p>
-      <w:pPr>
-        <w:spacing w:after="200"/>
-        <w:jc w:val="center"/>
-        <w:rPr>
-          <w:i/>
-          <w:color w:val="595959"/>
-          <w:sz w:val="18"/>
-        </w:rPr>
-      </w:pPr>
-      <w:r>
-        <w:rPr>
-          <w:i/>
-          <w:color w:val="595959"/>
-          <w:sz w:val="18"/>
-        </w:rPr>
-        <w:t>Figura 3 – Creazione dell'utente di servizio con password senza scadenza</w:t>
-      </w:r>
-    </w:p>
-    <w:p>
-      <w:pPr>
-        <w:spacing w:after="200"/>
-        <w:jc w:val="center"/>
-      </w:pPr>
-    </w:p>
-    <w:p>
-      <w:pPr>
-        <w:keepNext/>
-        <w:jc w:val="center"/>
-      </w:pPr>
-      <w:r>
-        <w:rPr>
-          <w:noProof/>
-        </w:rPr>
-        <w:drawing>
-          <wp:inline distT="0" distB="0" distL="0" distR="0" wp14:anchorId="5CDFB6D9" wp14:editId="0D768897">
-            <wp:extent cx="3060000" cy="3679359"/>
-            <wp:effectExtent l="0" t="0" r="0" b="0"/>
-            <wp:docPr id="4" name="Picture 4"/>
-            <wp:cNvGraphicFramePr>
-              <a:graphicFrameLocks xmlns:a="http://schemas.openxmlformats.org/drawingml/2006/main" noChangeAspect="1"/>
-            </wp:cNvGraphicFramePr>
-            <a:graphic xmlns:a="http://schemas.openxmlformats.org/drawingml/2006/main">
-              <a:graphicData uri="http://schemas.openxmlformats.org/drawingml/2006/picture">
-                <pic:pic xmlns:pic="http://schemas.openxmlformats.org/drawingml/2006/picture">
-                  <pic:nvPicPr>
-                    <pic:cNvPr id="0" name="image.png"/>
-                    <pic:cNvPicPr/>
-                  </pic:nvPicPr>
-                  <pic:blipFill>
-                    <a:blip r:embed="rId10"/>
-                    <a:stretch>
-                      <a:fillRect/>
-                    </a:stretch>
-                  </pic:blipFill>
-                  <pic:spPr>
-                    <a:xfrm>
-                      <a:off x="0" y="0"/>
-                      <a:ext cx="3060000" cy="3679359"/>
-                    </a:xfrm>
-                    <a:prstGeom prst="rect">
-                      <a:avLst/>
-                    </a:prstGeom>
-                  </pic:spPr>
-                </pic:pic>
-              </a:graphicData>
-            </a:graphic>
-          </wp:inline>
-        </w:drawing>
-      </w:r>
-    </w:p>
-    <w:p>
-      <w:pPr>
-        <w:spacing w:after="200"/>
-        <w:jc w:val="center"/>
-      </w:pPr>
-      <w:r>
-        <w:rPr>
-          <w:i/>
-          <w:color w:val="595959"/>
-          <w:sz w:val="18"/>
-        </w:rPr>
-        <w:t xml:space="preserve">Figura 4 – Appartenenza ai gruppi </w:t>
-      </w:r>
-      <w:proofErr w:type="spellStart"/>
-      <w:r>
-        <w:rPr>
-          <w:i/>
-          <w:color w:val="595959"/>
-          <w:sz w:val="18"/>
-        </w:rPr>
-        <w:t>Administrators</w:t>
-      </w:r>
-      <w:proofErr w:type="spellEnd"/>
-      <w:r>
-        <w:rPr>
-          <w:i/>
-          <w:color w:val="595959"/>
-          <w:sz w:val="18"/>
-        </w:rPr>
-        <w:t xml:space="preserve"> e </w:t>
-      </w:r>
-      <w:proofErr w:type="spellStart"/>
-      <w:r>
-        <w:rPr>
-          <w:i/>
-          <w:color w:val="595959"/>
-          <w:sz w:val="18"/>
-        </w:rPr>
-        <w:t>Logon_Administrator</w:t>
-      </w:r>
-      <w:proofErr w:type="spellEnd"/>
-    </w:p>
+        <w:tblLayout w:type="fixed"/>
+      </w:tblPr>
+      <w:tblGrid>
+        <w:gridCol w:w="4819"/>
+        <w:gridCol w:w="4819"/>
+      </w:tblGrid>
+      <w:tr>
+        <w:trPr>
+          <w:cantSplit/>
+        </w:trPr>
+        <w:tc>
+          <w:tcPr>
+            <w:tcW w:type="dxa" w:w="4819"/>
+            <w:tcW w:w="4819" w:type="dxa"/>
+          </w:tcPr>
+          <w:p>
+            <w:pPr>
+              <w:keepNext/>
+              <w:spacing w:before="240"/>
+              <w:jc w:val="center"/>
+            </w:pPr>
+            <w:r>
+              <w:rPr>
+                <w:noProof/>
+              </w:rPr>
+              <w:drawing>
+                <wp:inline distT="0" distB="0" distL="0" distR="0" wp14:anchorId="5B5DE5B7" wp14:editId="3C427718">
+                  <wp:extent cx="2560000" cy="2880000"/>
+                  <wp:effectExtent l="0" t="0" r="0" b="0"/>
+                  <wp:docPr id="3" name="Picture 3"/>
+                  <wp:cNvGraphicFramePr>
+                    <a:graphicFrameLocks xmlns:a="http://schemas.openxmlformats.org/drawingml/2006/main" noChangeAspect="1"/>
+                  </wp:cNvGraphicFramePr>
+                  <a:graphic xmlns:a="http://schemas.openxmlformats.org/drawingml/2006/main">
+                    <a:graphicData uri="http://schemas.openxmlformats.org/drawingml/2006/picture">
+                      <pic:pic xmlns:pic="http://schemas.openxmlformats.org/drawingml/2006/picture">
+                        <pic:nvPicPr>
+                          <pic:cNvPr id="0" name="image.png"/>
+                          <pic:cNvPicPr/>
+                        </pic:nvPicPr>
+                        <pic:blipFill>
+                          <a:blip r:embed="rId9"/>
+                          <a:stretch>
+                            <a:fillRect/>
+                          </a:stretch>
+                        </pic:blipFill>
+                        <pic:spPr>
+                          <a:xfrm>
+                            <a:off x="0" y="0"/>
+                            <a:ext cx="2560000" cy="2880000"/>
+                          </a:xfrm>
+                          <a:prstGeom prst="rect">
+                            <a:avLst/>
+                          </a:prstGeom>
+                        </pic:spPr>
+                      </pic:pic>
+                    </a:graphicData>
+                  </a:graphic>
+                </wp:inline>
+              </w:drawing>
+            </w:r>
+          </w:p>
+          <w:p>
+            <w:pPr>
+              <w:spacing w:after="200"/>
+              <w:jc w:val="center"/>
+              <w:rPr>
+                <w:i/>
+                <w:color w:val="595959"/>
+                <w:sz w:val="18"/>
+              </w:rPr>
+            </w:pPr>
+            <w:r>
+              <w:rPr>
+                <w:i/>
+                <w:color w:val="595959"/>
+                <w:sz w:val="18"/>
+              </w:rPr>
+              <w:t>Figura 3 – Creazione dell'utente di servizio con password senza scadenza</w:t>
+            </w:r>
+          </w:p>
+        </w:tc>
+        <w:tc>
+          <w:tcPr>
+            <w:tcW w:type="dxa" w:w="4819"/>
+            <w:tcW w:w="4819" w:type="dxa"/>
+          </w:tcPr>
+          <w:p>
+            <w:pPr>
+              <w:keepNext/>
+              <w:spacing w:before="240"/>
+              <w:jc w:val="center"/>
+            </w:pPr>
+            <w:r>
+              <w:rPr>
+                <w:noProof/>
+              </w:rPr>
+              <w:drawing>
+                <wp:inline distT="0" distB="0" distL="0" distR="0" wp14:anchorId="5CDFB6D9" wp14:editId="0D768897">
+                  <wp:extent cx="2395199" cy="2880000"/>
+                  <wp:effectExtent l="0" t="0" r="0" b="0"/>
+                  <wp:docPr id="4" name="Picture 4"/>
+                  <wp:cNvGraphicFramePr>
+                    <a:graphicFrameLocks xmlns:a="http://schemas.openxmlformats.org/drawingml/2006/main" noChangeAspect="1"/>
+                  </wp:cNvGraphicFramePr>
+                  <a:graphic xmlns:a="http://schemas.openxmlformats.org/drawingml/2006/main">
+                    <a:graphicData uri="http://schemas.openxmlformats.org/drawingml/2006/picture">
+                      <pic:pic xmlns:pic="http://schemas.openxmlformats.org/drawingml/2006/picture">
+                        <pic:nvPicPr>
+                          <pic:cNvPr id="0" name="image.png"/>
+                          <pic:cNvPicPr/>
+                        </pic:nvPicPr>
+                        <pic:blipFill>
+                          <a:blip r:embed="rId10"/>
+                          <a:stretch>
+                            <a:fillRect/>
+                          </a:stretch>
+                        </pic:blipFill>
+                        <pic:spPr>
+                          <a:xfrm>
+                            <a:off x="0" y="0"/>
+                            <a:ext cx="2395199" cy="2880000"/>
+                          </a:xfrm>
+                          <a:prstGeom prst="rect">
+                            <a:avLst/>
+                          </a:prstGeom>
+                        </pic:spPr>
+                      </pic:pic>
+                    </a:graphicData>
+                  </a:graphic>
+                </wp:inline>
+              </w:drawing>
+            </w:r>
+          </w:p>
+          <w:p>
+            <w:pPr>
+              <w:spacing w:after="200"/>
+              <w:jc w:val="center"/>
+            </w:pPr>
+            <w:r>
+              <w:rPr>
+                <w:i/>
+                <w:color w:val="595959"/>
+                <w:sz w:val="18"/>
+              </w:rPr>
+              <w:t xml:space="preserve">Figura 4 – Appartenenza ai gruppi </w:t>
+            </w:r>
+            <w:proofErr w:type="spellStart"/>
+            <w:r>
+              <w:rPr>
+                <w:i/>
+                <w:color w:val="595959"/>
+                <w:sz w:val="18"/>
+              </w:rPr>
+              <w:t>Administrators</w:t>
+            </w:r>
+            <w:proofErr w:type="spellEnd"/>
+            <w:r>
+              <w:rPr>
+                <w:i/>
+                <w:color w:val="595959"/>
+                <w:sz w:val="18"/>
+              </w:rPr>
+              <w:t xml:space="preserve"> e </w:t>
+            </w:r>
+            <w:proofErr w:type="spellStart"/>
+            <w:r>
+              <w:rPr>
+                <w:i/>
+                <w:color w:val="595959"/>
+                <w:sz w:val="18"/>
+              </w:rPr>
+              <w:t>Logon_Administrator</w:t>
+            </w:r>
+            <w:proofErr w:type="spellEnd"/>
+          </w:p>
+        </w:tc>
+      </w:tr>
+    </w:tbl>
     <w:p>
       <w:pPr>
         <w:pBdr>
@@ -1974,10 +3032,12 @@
       <w:pPr>
         <w:pStyle w:val="Titolo2"/>
       </w:pPr>
+      <w:bookmarkStart w:id="9007" w:name="_Toc008"/>
       <w:r>
         <w:lastRenderedPageBreak/>
         <w:t>4.4 Configurazione di SIMATIC Logon</w:t>
       </w:r>
+      <w:bookmarkEnd w:id="9007"/>
     </w:p>
     <w:p>
       <w:pPr>
@@ -1988,15 +3048,127 @@
         </w:numPr>
       </w:pPr>
       <w:r>
+        <w:rPr/>
         <w:t xml:space="preserve">Aprire </w:t>
       </w:r>
       <w:r>
         <w:rPr>
           <w:b/>
-        </w:rPr>
-        <w:t>Start → Siemens Automation → SIMATIC → SIMATIC Logon → Configura SIMATIC Logon</w:t>
-      </w:r>
-      <w:r>
+          <w:color w:val="1F4E79"/>
+          <w:shd w:val="clear" w:color="auto" w:fill="E3EDF7"/>
+        </w:rPr>
+        <w:t>Start</w:t>
+      </w:r>
+      <w:r>
+        <w:rPr>
+          <w:b/>
+        </w:rPr>
+        <w:t xml:space="preserve"> </w:t>
+      </w:r>
+      <w:r>
+        <w:rPr>
+          <w:b/>
+          <w:color w:val="1F4E79"/>
+        </w:rPr>
+        <w:t>→</w:t>
+      </w:r>
+      <w:r>
+        <w:rPr>
+          <w:b/>
+        </w:rPr>
+        <w:t xml:space="preserve"> </w:t>
+      </w:r>
+      <w:r>
+        <w:rPr>
+          <w:b/>
+          <w:color w:val="1F4E79"/>
+          <w:shd w:val="clear" w:color="auto" w:fill="E3EDF7"/>
+        </w:rPr>
+        <w:t>Siemens Automation</w:t>
+      </w:r>
+      <w:r>
+        <w:rPr>
+          <w:b/>
+        </w:rPr>
+        <w:t xml:space="preserve"> </w:t>
+      </w:r>
+      <w:r>
+        <w:rPr>
+          <w:b/>
+          <w:color w:val="1F4E79"/>
+        </w:rPr>
+        <w:t>→</w:t>
+      </w:r>
+      <w:r>
+        <w:rPr>
+          <w:b/>
+        </w:rPr>
+        <w:t xml:space="preserve"> </w:t>
+      </w:r>
+      <w:r>
+        <w:rPr>
+          <w:b/>
+          <w:color w:val="1F4E79"/>
+          <w:shd w:val="clear" w:color="auto" w:fill="E3EDF7"/>
+        </w:rPr>
+        <w:t>SIMATIC</w:t>
+      </w:r>
+      <w:r>
+        <w:rPr>
+          <w:b/>
+        </w:rPr>
+        <w:t xml:space="preserve"> </w:t>
+      </w:r>
+      <w:r>
+        <w:rPr>
+          <w:b/>
+          <w:color w:val="1F4E79"/>
+        </w:rPr>
+        <w:t>→</w:t>
+      </w:r>
+      <w:r>
+        <w:rPr>
+          <w:b/>
+        </w:rPr>
+        <w:t xml:space="preserve"> </w:t>
+      </w:r>
+      <w:r>
+        <w:rPr>
+          <w:b/>
+          <w:color w:val="1F4E79"/>
+          <w:shd w:val="clear" w:color="auto" w:fill="E3EDF7"/>
+        </w:rPr>
+        <w:t>SIMATIC Logon</w:t>
+      </w:r>
+      <w:r>
+        <w:rPr>
+          <w:b/>
+        </w:rPr>
+        <w:t xml:space="preserve"> </w:t>
+      </w:r>
+      <w:r>
+        <w:rPr>
+          <w:b/>
+          <w:color w:val="1F4E79"/>
+        </w:rPr>
+        <w:t>→</w:t>
+      </w:r>
+      <w:r>
+        <w:rPr>
+          <w:b/>
+        </w:rPr>
+        <w:t xml:space="preserve"> </w:t>
+      </w:r>
+      <w:r>
+        <w:rPr>
+          <w:b/>
+          <w:color w:val="1F4E79"/>
+          <w:shd w:val="clear" w:color="auto" w:fill="E3EDF7"/>
+        </w:rPr>
+        <w:t>Configura SIMATIC Logon</w:t>
+      </w:r>
+      <w:r>
+        <w:rPr/>
         <w:t>.</w:t>
       </w:r>
     </w:p>
@@ -2054,6 +3226,7 @@
     <w:p>
       <w:pPr>
         <w:pStyle w:val="Paragrafoelenco"/>
+        <w:keepNext/>
         <w:numPr>
           <w:ilvl w:val="0"/>
           <w:numId w:val="11"/>
@@ -2074,13 +3247,8 @@
     </w:p>
     <w:p>
       <w:pPr>
-        <w:pStyle w:val="Paragrafoelenco"/>
-        <w:ind w:left="540"/>
-      </w:pPr>
-    </w:p>
-    <w:p>
-      <w:pPr>
         <w:keepNext/>
+        <w:spacing w:before="240"/>
         <w:jc w:val="center"/>
       </w:pPr>
       <w:r>
@@ -2089,7 +3257,7 @@
         </w:rPr>
         <w:drawing>
           <wp:inline distT="0" distB="0" distL="0" distR="0" wp14:anchorId="1762AF99" wp14:editId="3FF73089">
-            <wp:extent cx="5580000" cy="3132632"/>
+            <wp:extent cx="5040000" cy="2829474"/>
             <wp:effectExtent l="0" t="0" r="0" b="0"/>
             <wp:docPr id="5" name="Picture 5"/>
             <wp:cNvGraphicFramePr>
@@ -2111,7 +3279,7 @@
                   <pic:spPr>
                     <a:xfrm>
                       <a:off x="0" y="0"/>
-                      <a:ext cx="5580000" cy="3132632"/>
+                      <a:ext cx="5040000" cy="2829474"/>
                     </a:xfrm>
                     <a:prstGeom prst="rect">
                       <a:avLst/>
@@ -2379,6 +3547,7 @@
     <w:p>
       <w:pPr>
         <w:keepNext/>
+        <w:spacing w:before="240"/>
         <w:jc w:val="center"/>
       </w:pPr>
       <w:r>
@@ -2440,10 +3609,12 @@
       <w:pPr>
         <w:pStyle w:val="Titolo2"/>
       </w:pPr>
+      <w:bookmarkStart w:id="9008" w:name="_Toc009"/>
       <w:r>
         <w:lastRenderedPageBreak/>
         <w:t>4.5 Creazione dei gruppi</w:t>
       </w:r>
+      <w:bookmarkEnd w:id="9008"/>
     </w:p>
     <w:p>
       <w:r>
@@ -2487,36 +3658,126 @@
         </w:numPr>
       </w:pPr>
       <w:r>
+        <w:rPr/>
         <w:t xml:space="preserve">Sul server aprire </w:t>
       </w:r>
       <w:r>
         <w:rPr>
           <w:b/>
-        </w:rPr>
-        <w:t>Gestione computer → Utenti e gruppi locali → Gruppi</w:t>
-      </w:r>
-      <w:r>
+          <w:color w:val="1F4E79"/>
+          <w:shd w:val="clear" w:color="auto" w:fill="E3EDF7"/>
+        </w:rPr>
+        <w:t>Gestione computer</w:t>
+      </w:r>
+      <w:r>
+        <w:rPr>
+          <w:b/>
+        </w:rPr>
+        <w:t xml:space="preserve"> </w:t>
+      </w:r>
+      <w:r>
+        <w:rPr>
+          <w:b/>
+          <w:color w:val="1F4E79"/>
+        </w:rPr>
+        <w:t>→</w:t>
+      </w:r>
+      <w:r>
+        <w:rPr>
+          <w:b/>
+        </w:rPr>
+        <w:t xml:space="preserve"> </w:t>
+      </w:r>
+      <w:r>
+        <w:rPr>
+          <w:b/>
+          <w:color w:val="1F4E79"/>
+          <w:shd w:val="clear" w:color="auto" w:fill="E3EDF7"/>
+        </w:rPr>
+        <w:t>Utenti e gruppi locali</w:t>
+      </w:r>
+      <w:r>
+        <w:rPr>
+          <w:b/>
+        </w:rPr>
+        <w:t xml:space="preserve"> </w:t>
+      </w:r>
+      <w:r>
+        <w:rPr>
+          <w:b/>
+          <w:color w:val="1F4E79"/>
+        </w:rPr>
+        <w:t>→</w:t>
+      </w:r>
+      <w:r>
+        <w:rPr>
+          <w:b/>
+        </w:rPr>
+        <w:t xml:space="preserve"> </w:t>
+      </w:r>
+      <w:r>
+        <w:rPr>
+          <w:b/>
+          <w:color w:val="1F4E79"/>
+          <w:shd w:val="clear" w:color="auto" w:fill="E3EDF7"/>
+        </w:rPr>
+        <w:t>Gruppi</w:t>
+      </w:r>
+      <w:r>
+        <w:rPr/>
         <w:t>.</w:t>
       </w:r>
     </w:p>
     <w:p>
       <w:pPr>
         <w:pStyle w:val="Paragrafoelenco"/>
+        <w:keepNext/>
         <w:numPr>
           <w:ilvl w:val="0"/>
           <w:numId w:val="12"/>
         </w:numPr>
       </w:pPr>
       <w:r>
+        <w:rPr/>
         <w:t xml:space="preserve">Con </w:t>
       </w:r>
       <w:r>
         <w:rPr>
           <w:b/>
-        </w:rPr>
-        <w:t>tasto destro → Nuovo gruppo</w:t>
-      </w:r>
-      <w:r>
+          <w:color w:val="1F4E79"/>
+          <w:shd w:val="clear" w:color="auto" w:fill="E3EDF7"/>
+        </w:rPr>
+        <w:t>tasto destro</w:t>
+      </w:r>
+      <w:r>
+        <w:rPr>
+          <w:b/>
+        </w:rPr>
+        <w:t xml:space="preserve"> </w:t>
+      </w:r>
+      <w:r>
+        <w:rPr>
+          <w:b/>
+          <w:color w:val="1F4E79"/>
+        </w:rPr>
+        <w:t>→</w:t>
+      </w:r>
+      <w:r>
+        <w:rPr>
+          <w:b/>
+        </w:rPr>
+        <w:t xml:space="preserve"> </w:t>
+      </w:r>
+      <w:r>
+        <w:rPr>
+          <w:b/>
+          <w:color w:val="1F4E79"/>
+          <w:shd w:val="clear" w:color="auto" w:fill="E3EDF7"/>
+        </w:rPr>
+        <w:t>Nuovo gruppo</w:t>
+      </w:r>
+      <w:r>
+        <w:rPr/>
         <w:t xml:space="preserve"> creare un gruppo per ciascun gruppo del progetto, con </w:t>
       </w:r>
       <w:r>
@@ -2526,21 +3787,14 @@
         <w:t>nome identico</w:t>
       </w:r>
       <w:r>
-        <w:t xml:space="preserve"> (maiuscole/minuscole comprese)</w:t>
-      </w:r>
-      <w:r>
-        <w:t>.</w:t>
-      </w:r>
-    </w:p>
-    <w:p>
-      <w:pPr>
-        <w:pStyle w:val="Paragrafoelenco"/>
-        <w:ind w:left="540"/>
-      </w:pPr>
+        <w:rPr/>
+        <w:t xml:space="preserve"> (maiuscole/minuscole comprese).</w:t>
+      </w:r>
     </w:p>
     <w:p>
       <w:pPr>
         <w:keepNext/>
+        <w:spacing w:before="240"/>
         <w:jc w:val="center"/>
       </w:pPr>
       <w:r>
@@ -2636,9 +3890,11 @@
       <w:pPr>
         <w:pStyle w:val="Titolo2"/>
       </w:pPr>
+      <w:bookmarkStart w:id="9009" w:name="_Toc010"/>
       <w:r>
         <w:t>4.6 Creazione degli utenti</w:t>
       </w:r>
+      <w:bookmarkEnd w:id="9009"/>
     </w:p>
     <w:p>
       <w:pPr>
@@ -2725,7 +3981,6 @@
         <w:t>Utenti di prova consigliati, uno per livello:</w:t>
       </w:r>
     </w:p>
-    <w:p/>
     <w:tbl>
       <w:tblPr>
         <w:tblW w:w="0" w:type="auto"/>
@@ -3127,6 +4382,7 @@
     <w:p>
       <w:pPr>
         <w:keepNext/>
+        <w:spacing w:before="240"/>
         <w:jc w:val="center"/>
       </w:pPr>
       <w:r>
@@ -3136,7 +4392,7 @@
         <w:lastRenderedPageBreak/>
         <w:drawing>
           <wp:inline distT="0" distB="0" distL="0" distR="0" wp14:anchorId="05E0C22A" wp14:editId="1A857058">
-            <wp:extent cx="5580000" cy="3137223"/>
+            <wp:extent cx="5040000" cy="2833620"/>
             <wp:effectExtent l="0" t="0" r="0" b="0"/>
             <wp:docPr id="8" name="Picture 8"/>
             <wp:cNvGraphicFramePr>
@@ -3158,7 +4414,7 @@
                   <pic:spPr>
                     <a:xfrm>
                       <a:off x="0" y="0"/>
-                      <a:ext cx="5580000" cy="3137223"/>
+                      <a:ext cx="5040000" cy="2833620"/>
                     </a:xfrm>
                     <a:prstGeom prst="rect">
                       <a:avLst/>
@@ -3189,9 +4445,11 @@
       <w:pPr>
         <w:pStyle w:val="Titolo2"/>
       </w:pPr>
+      <w:bookmarkStart w:id="9010" w:name="_Toc011"/>
       <w:r>
         <w:t>4.7 Trasferimento delle licenze</w:t>
       </w:r>
+      <w:bookmarkEnd w:id="9010"/>
     </w:p>
     <w:p>
       <w:pPr>
@@ -3252,15 +4510,46 @@
         </w:numPr>
       </w:pPr>
       <w:r>
+        <w:rPr/>
         <w:t xml:space="preserve">Selezionare la licenza, </w:t>
       </w:r>
       <w:r>
         <w:rPr>
           <w:b/>
-        </w:rPr>
-        <w:t>tasto destro → Trasferisci</w:t>
-      </w:r>
-      <w:r>
+          <w:color w:val="1F4E79"/>
+          <w:shd w:val="clear" w:color="auto" w:fill="E3EDF7"/>
+        </w:rPr>
+        <w:t>tasto destro</w:t>
+      </w:r>
+      <w:r>
+        <w:rPr>
+          <w:b/>
+        </w:rPr>
+        <w:t xml:space="preserve"> </w:t>
+      </w:r>
+      <w:r>
+        <w:rPr>
+          <w:b/>
+          <w:color w:val="1F4E79"/>
+        </w:rPr>
+        <w:t>→</w:t>
+      </w:r>
+      <w:r>
+        <w:rPr>
+          <w:b/>
+        </w:rPr>
+        <w:t xml:space="preserve"> </w:t>
+      </w:r>
+      <w:r>
+        <w:rPr>
+          <w:b/>
+          <w:color w:val="1F4E79"/>
+          <w:shd w:val="clear" w:color="auto" w:fill="E3EDF7"/>
+        </w:rPr>
+        <w:t>Trasferisci</w:t>
+      </w:r>
+      <w:r>
+        <w:rPr/>
         <w:t xml:space="preserve"> e scegliere il </w:t>
       </w:r>
       <w:r>
@@ -3270,6 +4559,7 @@
         <w:t>Disco locale (C:)</w:t>
       </w:r>
       <w:r>
+        <w:rPr/>
         <w:t xml:space="preserve"> del server.</w:t>
       </w:r>
     </w:p>
@@ -3297,6 +4587,7 @@
     <w:p>
       <w:pPr>
         <w:pStyle w:val="Paragrafoelenco"/>
+        <w:keepNext/>
         <w:numPr>
           <w:ilvl w:val="0"/>
           <w:numId w:val="14"/>
@@ -3317,13 +4608,8 @@
     </w:p>
     <w:p>
       <w:pPr>
-        <w:pStyle w:val="Paragrafoelenco"/>
-        <w:ind w:left="540"/>
-      </w:pPr>
-    </w:p>
-    <w:p>
-      <w:pPr>
         <w:keepNext/>
+        <w:spacing w:before="240"/>
         <w:jc w:val="center"/>
       </w:pPr>
       <w:r>
@@ -3332,7 +4618,7 @@
         </w:rPr>
         <w:drawing>
           <wp:inline distT="0" distB="0" distL="0" distR="0" wp14:anchorId="0C33A475" wp14:editId="3438D0BB">
-            <wp:extent cx="5580000" cy="3128711"/>
+            <wp:extent cx="5040000" cy="2825932"/>
             <wp:effectExtent l="0" t="0" r="0" b="0"/>
             <wp:docPr id="9" name="Picture 9"/>
             <wp:cNvGraphicFramePr>
@@ -3354,7 +4640,7 @@
                   <pic:spPr>
                     <a:xfrm>
                       <a:off x="0" y="0"/>
-                      <a:ext cx="5580000" cy="3128711"/>
+                      <a:ext cx="5040000" cy="2825932"/>
                     </a:xfrm>
                     <a:prstGeom prst="rect">
                       <a:avLst/>
@@ -3369,6 +4655,7 @@
     </w:p>
     <w:p>
       <w:pPr>
+        <w:keepNext/>
         <w:spacing w:after="200"/>
         <w:jc w:val="center"/>
       </w:pPr>
@@ -3384,6 +4671,7 @@
     <w:p>
       <w:pPr>
         <w:keepNext/>
+        <w:spacing w:before="240"/>
         <w:jc w:val="center"/>
       </w:pPr>
       <w:r>
@@ -3393,7 +4681,7 @@
         <w:lastRenderedPageBreak/>
         <w:drawing>
           <wp:inline distT="0" distB="0" distL="0" distR="0" wp14:anchorId="02AC6091" wp14:editId="2A014ADB">
-            <wp:extent cx="5580000" cy="3137223"/>
+            <wp:extent cx="5040000" cy="2833620"/>
             <wp:effectExtent l="0" t="0" r="0" b="0"/>
             <wp:docPr id="10" name="Picture 10"/>
             <wp:cNvGraphicFramePr>
@@ -3415,7 +4703,7 @@
                   <pic:spPr>
                     <a:xfrm>
                       <a:off x="0" y="0"/>
-                      <a:ext cx="5580000" cy="3137223"/>
+                      <a:ext cx="5040000" cy="2833620"/>
                     </a:xfrm>
                     <a:prstGeom prst="rect">
                       <a:avLst/>
@@ -3446,9 +4734,11 @@
       <w:pPr>
         <w:pStyle w:val="Titolo2"/>
       </w:pPr>
+      <w:bookmarkStart w:id="9011" w:name="_Toc012"/>
       <w:r>
         <w:t>4.8 Server di prova su macchina virtuale</w:t>
       </w:r>
+      <w:bookmarkEnd w:id="9011"/>
     </w:p>
     <w:p>
       <w:r>
@@ -3583,6 +4873,7 @@
     <w:p>
       <w:pPr>
         <w:pStyle w:val="Paragrafoelenco"/>
+        <w:keepNext/>
         <w:numPr>
           <w:ilvl w:val="0"/>
           <w:numId w:val="15"/>
@@ -3611,13 +4902,8 @@
     </w:p>
     <w:p>
       <w:pPr>
-        <w:pStyle w:val="Paragrafoelenco"/>
-        <w:ind w:left="540"/>
-      </w:pPr>
-    </w:p>
-    <w:p>
-      <w:pPr>
         <w:keepNext/>
+        <w:spacing w:before="240"/>
         <w:jc w:val="center"/>
       </w:pPr>
       <w:r>
@@ -3626,7 +4912,7 @@
         </w:rPr>
         <w:drawing>
           <wp:inline distT="0" distB="0" distL="0" distR="0" wp14:anchorId="0EA18589" wp14:editId="658C984F">
-            <wp:extent cx="5580000" cy="2369136"/>
+            <wp:extent cx="5040000" cy="2139864"/>
             <wp:effectExtent l="0" t="0" r="0" b="0"/>
             <wp:docPr id="11" name="Picture 11"/>
             <wp:cNvGraphicFramePr>
@@ -3648,7 +4934,7 @@
                   <pic:spPr>
                     <a:xfrm>
                       <a:off x="0" y="0"/>
-                      <a:ext cx="5580000" cy="2369136"/>
+                      <a:ext cx="5040000" cy="2139864"/>
                     </a:xfrm>
                     <a:prstGeom prst="rect">
                       <a:avLst/>
@@ -3663,6 +4949,7 @@
     </w:p>
     <w:p>
       <w:pPr>
+        <w:keepNext/>
         <w:spacing w:after="200"/>
         <w:jc w:val="center"/>
       </w:pPr>
@@ -3696,6 +4983,7 @@
     <w:p>
       <w:pPr>
         <w:keepNext/>
+        <w:spacing w:before="240"/>
         <w:jc w:val="center"/>
       </w:pPr>
       <w:r>
@@ -3758,42 +5046,95 @@
       <w:pPr>
         <w:pStyle w:val="Titolo2"/>
       </w:pPr>
+      <w:bookmarkStart w:id="9012" w:name="_Toc013"/>
       <w:r>
         <w:t>4.9 Monitoraggio degli accessi</w:t>
       </w:r>
-    </w:p>
-    <w:p>
-      <w:r>
+      <w:bookmarkEnd w:id="9012"/>
+    </w:p>
+    <w:p>
+      <w:pPr>
+        <w:keepNext/>
+      </w:pPr>
+      <w:proofErr w:type="spellStart"/>
+      <w:proofErr w:type="spellEnd"/>
+      <w:r>
+        <w:rPr/>
         <w:t xml:space="preserve">Con </w:t>
       </w:r>
       <w:r>
         <w:rPr>
           <w:b/>
         </w:rPr>
-        <w:t xml:space="preserve">SIMATIC Logon </w:t>
-      </w:r>
-      <w:proofErr w:type="spellStart"/>
-      <w:r>
-        <w:rPr>
-          <w:b/>
-        </w:rPr>
-        <w:t>Eventlog</w:t>
-      </w:r>
-      <w:proofErr w:type="spellEnd"/>
-      <w:r>
-        <w:rPr>
-          <w:b/>
-        </w:rPr>
-        <w:t xml:space="preserve"> Viewer</w:t>
-      </w:r>
-      <w:r>
-        <w:t xml:space="preserve"> (Start → SIMATIC → SIMATIC Logon) si possono consultare login, logout e tentativi falliti degli utenti: utile in collaudo per dimostrare il funzionamento.</w:t>
-      </w:r>
-    </w:p>
-    <w:p/>
+        <w:t>SIMATIC Logon Eventlog Viewer</w:t>
+      </w:r>
+      <w:r>
+        <w:rPr/>
+        <w:t xml:space="preserve"> (</w:t>
+      </w:r>
+      <w:r>
+        <w:rPr>
+          <w:b/>
+          <w:color w:val="1F4E79"/>
+          <w:shd w:val="clear" w:color="auto" w:fill="E3EDF7"/>
+        </w:rPr>
+        <w:t>Start</w:t>
+      </w:r>
+      <w:r>
+        <w:rPr/>
+        <w:t xml:space="preserve"> </w:t>
+      </w:r>
+      <w:r>
+        <w:rPr>
+          <w:b/>
+          <w:color w:val="1F4E79"/>
+        </w:rPr>
+        <w:t>→</w:t>
+      </w:r>
+      <w:r>
+        <w:rPr/>
+        <w:t xml:space="preserve"> </w:t>
+      </w:r>
+      <w:r>
+        <w:rPr>
+          <w:b/>
+          <w:color w:val="1F4E79"/>
+          <w:shd w:val="clear" w:color="auto" w:fill="E3EDF7"/>
+        </w:rPr>
+        <w:t>SIMATIC</w:t>
+      </w:r>
+      <w:r>
+        <w:rPr/>
+        <w:t xml:space="preserve"> </w:t>
+      </w:r>
+      <w:r>
+        <w:rPr>
+          <w:b/>
+          <w:color w:val="1F4E79"/>
+        </w:rPr>
+        <w:t>→</w:t>
+      </w:r>
+      <w:r>
+        <w:rPr/>
+        <w:t xml:space="preserve"> </w:t>
+      </w:r>
+      <w:r>
+        <w:rPr>
+          <w:b/>
+          <w:color w:val="1F4E79"/>
+          <w:shd w:val="clear" w:color="auto" w:fill="E3EDF7"/>
+        </w:rPr>
+        <w:t>SIMATIC Logon</w:t>
+      </w:r>
+      <w:r>
+        <w:rPr/>
+        <w:t>) si possono consultare login, logout e tentativi falliti degli utenti: utile in collaudo per dimostrare il funzionamento.</w:t>
+      </w:r>
+    </w:p>
     <w:p>
       <w:pPr>
         <w:keepNext/>
+        <w:spacing w:before="240"/>
         <w:jc w:val="center"/>
       </w:pPr>
       <w:r>
@@ -3802,7 +5143,7 @@
         </w:rPr>
         <w:drawing>
           <wp:inline distT="0" distB="0" distL="0" distR="0" wp14:anchorId="3E68A17A" wp14:editId="4F07998A">
-            <wp:extent cx="5580000" cy="3126754"/>
+            <wp:extent cx="5040000" cy="2824164"/>
             <wp:effectExtent l="0" t="0" r="0" b="0"/>
             <wp:docPr id="13" name="Picture 13"/>
             <wp:cNvGraphicFramePr>
@@ -3824,7 +5165,7 @@
                   <pic:spPr>
                     <a:xfrm>
                       <a:off x="0" y="0"/>
-                      <a:ext cx="5580000" cy="3126754"/>
+                      <a:ext cx="5040000" cy="2824164"/>
                     </a:xfrm>
                     <a:prstGeom prst="rect">
                       <a:avLst/>
@@ -3878,10 +5219,12 @@
       <w:pPr>
         <w:pStyle w:val="Titolo1"/>
       </w:pPr>
+      <w:bookmarkStart w:id="9013" w:name="_Toc014"/>
       <w:r>
         <w:lastRenderedPageBreak/>
         <w:t>5. Parte B – Lato Pannello (progetto HMI)</w:t>
       </w:r>
+      <w:bookmarkEnd w:id="9013"/>
     </w:p>
     <w:p>
       <w:r>
@@ -3910,21 +5253,81 @@
       <w:pPr>
         <w:pStyle w:val="Titolo2"/>
       </w:pPr>
+      <w:bookmarkStart w:id="9014" w:name="_Toc015"/>
       <w:r>
         <w:t>5.1 Attivazione di SIMATIC Logon</w:t>
       </w:r>
-    </w:p>
-    <w:p>
-      <w:r>
+      <w:bookmarkEnd w:id="9014"/>
+    </w:p>
+    <w:p>
+      <w:r>
+        <w:rPr/>
         <w:t xml:space="preserve">Aprire </w:t>
       </w:r>
       <w:r>
         <w:rPr>
           <w:b/>
-        </w:rPr>
-        <w:t>[Pannello] → Impostazioni Runtime → Gestione utenti</w:t>
-      </w:r>
-      <w:r>
+          <w:color w:val="1F4E79"/>
+          <w:shd w:val="clear" w:color="auto" w:fill="E3EDF7"/>
+        </w:rPr>
+        <w:t>[Pannello]</w:t>
+      </w:r>
+      <w:r>
+        <w:rPr>
+          <w:b/>
+        </w:rPr>
+        <w:t xml:space="preserve"> </w:t>
+      </w:r>
+      <w:r>
+        <w:rPr>
+          <w:b/>
+          <w:color w:val="1F4E79"/>
+        </w:rPr>
+        <w:t>→</w:t>
+      </w:r>
+      <w:r>
+        <w:rPr>
+          <w:b/>
+        </w:rPr>
+        <w:t xml:space="preserve"> </w:t>
+      </w:r>
+      <w:r>
+        <w:rPr>
+          <w:b/>
+          <w:color w:val="1F4E79"/>
+          <w:shd w:val="clear" w:color="auto" w:fill="E3EDF7"/>
+        </w:rPr>
+        <w:t>Impostazioni Runtime</w:t>
+      </w:r>
+      <w:r>
+        <w:rPr>
+          <w:b/>
+        </w:rPr>
+        <w:t xml:space="preserve"> </w:t>
+      </w:r>
+      <w:r>
+        <w:rPr>
+          <w:b/>
+          <w:color w:val="1F4E79"/>
+        </w:rPr>
+        <w:t>→</w:t>
+      </w:r>
+      <w:r>
+        <w:rPr>
+          <w:b/>
+        </w:rPr>
+        <w:t xml:space="preserve"> </w:t>
+      </w:r>
+      <w:r>
+        <w:rPr>
+          <w:b/>
+          <w:color w:val="1F4E79"/>
+          <w:shd w:val="clear" w:color="auto" w:fill="E3EDF7"/>
+        </w:rPr>
+        <w:t>Gestione utenti</w:t>
+      </w:r>
+      <w:r>
+        <w:rPr/>
         <w:t xml:space="preserve"> e compilare la sezione </w:t>
       </w:r>
       <w:r>
@@ -3934,10 +5337,10 @@
         <w:t>SIMATIC Logon</w:t>
       </w:r>
       <w:r>
+        <w:rPr/>
         <w:t>:</w:t>
       </w:r>
     </w:p>
-    <w:p/>
     <w:tbl>
       <w:tblPr>
         <w:tblW w:w="0" w:type="auto"/>
@@ -4337,6 +5740,7 @@
     <w:p>
       <w:pPr>
         <w:keepNext/>
+        <w:spacing w:before="240"/>
         <w:jc w:val="center"/>
       </w:pPr>
       <w:r>
@@ -4345,7 +5749,7 @@
         </w:rPr>
         <w:drawing>
           <wp:inline distT="0" distB="0" distL="0" distR="0" wp14:anchorId="719A2343" wp14:editId="4147C344">
-            <wp:extent cx="5580000" cy="3354065"/>
+            <wp:extent cx="4791320" cy="2880000"/>
             <wp:effectExtent l="0" t="0" r="0" b="0"/>
             <wp:docPr id="14" name="Picture 14"/>
             <wp:cNvGraphicFramePr>
@@ -4367,7 +5771,7 @@
                   <pic:spPr>
                     <a:xfrm>
                       <a:off x="0" y="0"/>
-                      <a:ext cx="5580000" cy="3354065"/>
+                      <a:ext cx="4791320" cy="2880000"/>
                     </a:xfrm>
                     <a:prstGeom prst="rect">
                       <a:avLst/>
@@ -4416,21 +5820,57 @@
       <w:pPr>
         <w:pStyle w:val="Titolo2"/>
       </w:pPr>
+      <w:bookmarkStart w:id="9015" w:name="_Toc016"/>
       <w:r>
         <w:t>5.2 Gruppi e autorizzazioni</w:t>
       </w:r>
-    </w:p>
-    <w:p>
-      <w:r>
+      <w:bookmarkEnd w:id="9015"/>
+    </w:p>
+    <w:p>
+      <w:pPr>
+        <w:keepNext/>
+      </w:pPr>
+      <w:r>
+        <w:rPr/>
         <w:t xml:space="preserve">In </w:t>
       </w:r>
       <w:r>
         <w:rPr>
           <w:b/>
-        </w:rPr>
-        <w:t>Gestione utenti → Gruppi</w:t>
-      </w:r>
-      <w:r>
+          <w:color w:val="1F4E79"/>
+          <w:shd w:val="clear" w:color="auto" w:fill="E3EDF7"/>
+        </w:rPr>
+        <w:t>Gestione utenti</w:t>
+      </w:r>
+      <w:r>
+        <w:rPr>
+          <w:b/>
+        </w:rPr>
+        <w:t xml:space="preserve"> </w:t>
+      </w:r>
+      <w:r>
+        <w:rPr>
+          <w:b/>
+          <w:color w:val="1F4E79"/>
+        </w:rPr>
+        <w:t>→</w:t>
+      </w:r>
+      <w:r>
+        <w:rPr>
+          <w:b/>
+        </w:rPr>
+        <w:t xml:space="preserve"> </w:t>
+      </w:r>
+      <w:r>
+        <w:rPr>
+          <w:b/>
+          <w:color w:val="1F4E79"/>
+          <w:shd w:val="clear" w:color="auto" w:fill="E3EDF7"/>
+        </w:rPr>
+        <w:t>Gruppi</w:t>
+      </w:r>
+      <w:r>
+        <w:rPr/>
         <w:t xml:space="preserve"> creare i gruppi richiesti; per ogni gruppo spuntare nella tabella </w:t>
       </w:r>
       <w:r>
@@ -4440,12 +5880,14 @@
         <w:t>Autorizzazioni</w:t>
       </w:r>
       <w:r>
+        <w:rPr/>
         <w:t xml:space="preserve"> i diritti che i suoi membri devono avere. Tutti gli utenti del server associati a un gruppo ricevono automaticamente quelle autorizzazioni.</w:t>
       </w:r>
     </w:p>
     <w:p>
       <w:pPr>
         <w:keepNext/>
+        <w:spacing w:before="240"/>
         <w:jc w:val="center"/>
       </w:pPr>
       <w:r>
@@ -4455,7 +5897,7 @@
         <w:lastRenderedPageBreak/>
         <w:drawing>
           <wp:inline distT="0" distB="0" distL="0" distR="0" wp14:anchorId="791AE057" wp14:editId="171D653D">
-            <wp:extent cx="5580000" cy="3062978"/>
+            <wp:extent cx="5040000" cy="2766560"/>
             <wp:effectExtent l="0" t="0" r="0" b="0"/>
             <wp:docPr id="15" name="Picture 15"/>
             <wp:cNvGraphicFramePr>
@@ -4477,7 +5919,7 @@
                   <pic:spPr>
                     <a:xfrm>
                       <a:off x="0" y="0"/>
-                      <a:ext cx="5580000" cy="3062978"/>
+                      <a:ext cx="5040000" cy="2766560"/>
                     </a:xfrm>
                     <a:prstGeom prst="rect">
                       <a:avLst/>
@@ -4526,41 +5968,102 @@
       <w:pPr>
         <w:pStyle w:val="Titolo2"/>
       </w:pPr>
+      <w:bookmarkStart w:id="9016" w:name="_Toc017"/>
       <w:r>
         <w:t>5.3 Tempo di disconnessione automatica</w:t>
       </w:r>
-    </w:p>
-    <w:p>
-      <w:pPr>
+      <w:bookmarkEnd w:id="9016"/>
+    </w:p>
+    <w:p>
+      <w:pPr>
+        <w:keepNext/>
         <w:spacing w:after="120"/>
       </w:pPr>
       <w:r>
+        <w:rPr/>
         <w:t>Il tempo di disconnessione automatica degli utenti autenticati tramite SIMATIC Logon è quello impostato nel progetto HMI sull’</w:t>
       </w:r>
       <w:r>
         <w:rPr>
           <w:b/>
-          <w:bCs/>
         </w:rPr>
         <w:t>utente locale con Numero 1</w:t>
       </w:r>
       <w:r>
+        <w:rPr/>
         <w:t xml:space="preserve"> (l’utente amministratore locale), in </w:t>
       </w:r>
       <w:r>
         <w:rPr>
           <w:b/>
-          <w:bCs/>
-        </w:rPr>
-        <w:t>Gestione utenti → Utenti → Tempo di scollegamento</w:t>
-      </w:r>
-      <w:r>
+          <w:color w:val="1F4E79"/>
+          <w:shd w:val="clear" w:color="auto" w:fill="E3EDF7"/>
+        </w:rPr>
+        <w:t>Gestione utenti</w:t>
+      </w:r>
+      <w:r>
+        <w:rPr>
+          <w:b/>
+        </w:rPr>
+        <w:t xml:space="preserve"> </w:t>
+      </w:r>
+      <w:r>
+        <w:rPr>
+          <w:b/>
+          <w:color w:val="1F4E79"/>
+        </w:rPr>
+        <w:t>→</w:t>
+      </w:r>
+      <w:r>
+        <w:rPr>
+          <w:b/>
+        </w:rPr>
+        <w:t xml:space="preserve"> </w:t>
+      </w:r>
+      <w:r>
+        <w:rPr>
+          <w:b/>
+          <w:color w:val="1F4E79"/>
+          <w:shd w:val="clear" w:color="auto" w:fill="E3EDF7"/>
+        </w:rPr>
+        <w:t>Utenti</w:t>
+      </w:r>
+      <w:r>
+        <w:rPr>
+          <w:b/>
+        </w:rPr>
+        <w:t xml:space="preserve"> </w:t>
+      </w:r>
+      <w:r>
+        <w:rPr>
+          <w:b/>
+          <w:color w:val="1F4E79"/>
+        </w:rPr>
+        <w:t>→</w:t>
+      </w:r>
+      <w:r>
+        <w:rPr>
+          <w:b/>
+        </w:rPr>
+        <w:t xml:space="preserve"> </w:t>
+      </w:r>
+      <w:r>
+        <w:rPr>
+          <w:b/>
+          <w:color w:val="1F4E79"/>
+          <w:shd w:val="clear" w:color="auto" w:fill="E3EDF7"/>
+        </w:rPr>
+        <w:t>Tempo di scollegamento</w:t>
+      </w:r>
+      <w:r>
+        <w:rPr/>
         <w:t>.</w:t>
       </w:r>
     </w:p>
     <w:p>
       <w:pPr>
         <w:keepNext/>
+        <w:spacing w:before="240"/>
         <w:jc w:val="center"/>
       </w:pPr>
       <w:r>
@@ -4656,9 +6159,11 @@
       <w:pPr>
         <w:pStyle w:val="Titolo2"/>
       </w:pPr>
+      <w:bookmarkStart w:id="9017" w:name="_Toc018"/>
       <w:r>
         <w:t>5.4 Comportamento con server collegato / scollegato</w:t>
       </w:r>
+      <w:bookmarkEnd w:id="9017"/>
     </w:p>
     <w:tbl>
       <w:tblPr>
@@ -4977,10 +6482,12 @@
       <w:pPr>
         <w:pStyle w:val="Titolo2"/>
       </w:pPr>
+      <w:bookmarkStart w:id="9018" w:name="_Toc019"/>
       <w:r>
         <w:lastRenderedPageBreak/>
         <w:t>5.5 Differenze tra pannello e Panel PC</w:t>
       </w:r>
+      <w:bookmarkEnd w:id="9018"/>
     </w:p>
     <w:tbl>
       <w:tblPr>
@@ -5582,9 +7089,11 @@
       <w:pPr>
         <w:pStyle w:val="Titolo1"/>
       </w:pPr>
+      <w:bookmarkStart w:id="9019" w:name="_Toc020"/>
       <w:r>
         <w:t>6. Verifica del funzionamento</w:t>
       </w:r>
+      <w:bookmarkEnd w:id="9019"/>
     </w:p>
     <w:p>
       <w:r>
@@ -5730,9 +7239,11 @@
       <w:pPr>
         <w:pStyle w:val="Titolo2"/>
       </w:pPr>
+      <w:bookmarkStart w:id="9020" w:name="_Toc021"/>
       <w:r>
         <w:t>6.1 Problemi frequenti</w:t>
       </w:r>
+      <w:bookmarkEnd w:id="9020"/>
     </w:p>
     <w:tbl>
       <w:tblPr>
@@ -6143,10 +7654,12 @@
       <w:pPr>
         <w:pStyle w:val="Titolo1"/>
       </w:pPr>
+      <w:bookmarkStart w:id="9021" w:name="_Toc022"/>
       <w:r>
         <w:lastRenderedPageBreak/>
         <w:t>7. Messa in servizio presso il cliente</w:t>
       </w:r>
+      <w:bookmarkEnd w:id="9021"/>
     </w:p>
     <w:p>
       <w:pPr>

</xml_diff>